<commit_message>
Remove View_C. Improve View_D (Rotate view).
</commit_message>
<xml_diff>
--- a/copilot prompts.docx
+++ b/copilot prompts.docx
@@ -2,6 +2,1009 @@
 <file path=word/document.xml><?xml version="1.0" encoding="utf-8"?>
 <w:document xmlns:wpc="http://schemas.microsoft.com/office/word/2010/wordprocessingCanvas" xmlns:cx="http://schemas.microsoft.com/office/drawing/2014/chartex" xmlns:cx1="http://schemas.microsoft.com/office/drawing/2015/9/8/chartex" xmlns:cx2="http://schemas.microsoft.com/office/drawing/2015/10/21/chartex" xmlns:cx3="http://schemas.microsoft.com/office/drawing/2016/5/9/chartex" xmlns:cx4="http://schemas.microsoft.com/office/drawing/2016/5/10/chartex" xmlns:cx5="http://schemas.microsoft.com/office/drawing/2016/5/11/chartex" xmlns:cx6="http://schemas.microsoft.com/office/drawing/2016/5/12/chartex" xmlns:cx7="http://schemas.microsoft.com/office/drawing/2016/5/13/chartex" xmlns:cx8="http://schemas.microsoft.com/office/drawing/2016/5/14/chartex" xmlns:mc="http://schemas.openxmlformats.org/markup-compatibility/2006" xmlns:aink="http://schemas.microsoft.com/office/drawing/2016/ink" xmlns:am3d="http://schemas.microsoft.com/office/drawing/2017/model3d" xmlns:o="urn:schemas-microsoft-com:office:office" xmlns:oel="http://schemas.microsoft.com/office/2019/extlst" xmlns:r="http://schemas.openxmlformats.org/officeDocument/2006/relationships" xmlns:m="http://schemas.openxmlformats.org/officeDocument/2006/math" xmlns:v="urn:schemas-microsoft-com:vml" xmlns:wp14="http://schemas.microsoft.com/office/word/2010/wordprocessingDrawing" xmlns:wp="http://schemas.openxmlformats.org/drawingml/2006/wordprocessingDrawing" xmlns:w10="urn:schemas-microsoft-com:office:word" xmlns:w="http://schemas.openxmlformats.org/wordprocessingml/2006/main" xmlns:w14="http://schemas.microsoft.com/office/word/2010/wordml" xmlns:w15="http://schemas.microsoft.com/office/word/2012/wordml" xmlns:w16cex="http://schemas.microsoft.com/office/word/2018/wordml/cex" xmlns:w16cid="http://schemas.microsoft.com/office/word/2016/wordml/cid" xmlns:w16="http://schemas.microsoft.com/office/word/2018/wordml" xmlns:w16sdtdh="http://schemas.microsoft.com/office/word/2020/wordml/sdtdatahash" xmlns:w16se="http://schemas.microsoft.com/office/word/2015/wordml/symex" xmlns:wpg="http://schemas.microsoft.com/office/word/2010/wordprocessingGroup" xmlns:wpi="http://schemas.microsoft.com/office/word/2010/wordprocessingInk" xmlns:wne="http://schemas.microsoft.com/office/word/2006/wordml" xmlns:wps="http://schemas.microsoft.com/office/word/2010/wordprocessingShape" mc:Ignorable="w14 w15 w16se w16cid w16 w16cex w16sdtdh wp14">
   <w:body>
+    <w:sdt>
+      <w:sdtPr>
+        <w:id w:val="1440411666"/>
+        <w:docPartObj>
+          <w:docPartGallery w:val="Table of Contents"/>
+          <w:docPartUnique/>
+        </w:docPartObj>
+      </w:sdtPr>
+      <w:sdtEndPr>
+        <w:rPr>
+          <w:rFonts w:asciiTheme="minorHAnsi" w:eastAsiaTheme="minorHAnsi" w:hAnsiTheme="minorHAnsi" w:cstheme="minorBidi"/>
+          <w:b/>
+          <w:bCs/>
+          <w:noProof/>
+          <w:color w:val="auto"/>
+          <w:sz w:val="22"/>
+          <w:szCs w:val="22"/>
+          <w:lang w:val="en-AU"/>
+        </w:rPr>
+      </w:sdtEndPr>
+      <w:sdtContent>
+        <w:p>
+          <w:pPr>
+            <w:pStyle w:val="TOCHeading"/>
+          </w:pPr>
+          <w:r>
+            <w:t>Contents</w:t>
+          </w:r>
+        </w:p>
+        <w:p>
+          <w:pPr>
+            <w:pStyle w:val="TOC1"/>
+            <w:tabs>
+              <w:tab w:val="right" w:leader="dot" w:pos="9350"/>
+            </w:tabs>
+            <w:rPr>
+              <w:noProof/>
+            </w:rPr>
+          </w:pPr>
+          <w:r>
+            <w:fldChar w:fldCharType="begin"/>
+          </w:r>
+          <w:r>
+            <w:instrText xml:space="preserve"> TOC \o "1-3" \h \z \u </w:instrText>
+          </w:r>
+          <w:r>
+            <w:fldChar w:fldCharType="separate"/>
+          </w:r>
+          <w:hyperlink w:anchor="_Toc224840311" w:history="1">
+            <w:r>
+              <w:rPr>
+                <w:rStyle w:val="Hyperlink"/>
+                <w:rFonts w:ascii="Segoe UI Emoji" w:eastAsia="Times New Roman" w:hAnsi="Segoe UI Emoji" w:cs="Segoe UI Emoji"/>
+                <w:noProof/>
+                <w:lang w:val="en-US"/>
+              </w:rPr>
+              <w:t>🔑</w:t>
+            </w:r>
+            <w:r>
+              <w:rPr>
+                <w:rStyle w:val="Hyperlink"/>
+                <w:rFonts w:eastAsia="Times New Roman"/>
+                <w:noProof/>
+                <w:lang w:val="en-US"/>
+              </w:rPr>
+              <w:t xml:space="preserve"> NEXT STEPS (In Order)</w:t>
+            </w:r>
+            <w:r>
+              <w:rPr>
+                <w:noProof/>
+                <w:webHidden/>
+              </w:rPr>
+              <w:tab/>
+            </w:r>
+            <w:r>
+              <w:rPr>
+                <w:noProof/>
+                <w:webHidden/>
+              </w:rPr>
+              <w:fldChar w:fldCharType="begin"/>
+            </w:r>
+            <w:r>
+              <w:rPr>
+                <w:noProof/>
+                <w:webHidden/>
+              </w:rPr>
+              <w:instrText xml:space="preserve"> PAGEREF _Toc224840311 \h </w:instrText>
+            </w:r>
+            <w:r>
+              <w:rPr>
+                <w:noProof/>
+                <w:webHidden/>
+              </w:rPr>
+            </w:r>
+            <w:r>
+              <w:rPr>
+                <w:noProof/>
+                <w:webHidden/>
+              </w:rPr>
+              <w:fldChar w:fldCharType="separate"/>
+            </w:r>
+            <w:r>
+              <w:rPr>
+                <w:noProof/>
+                <w:webHidden/>
+              </w:rPr>
+              <w:t>1</w:t>
+            </w:r>
+            <w:r>
+              <w:rPr>
+                <w:noProof/>
+                <w:webHidden/>
+              </w:rPr>
+              <w:fldChar w:fldCharType="end"/>
+            </w:r>
+          </w:hyperlink>
+        </w:p>
+        <w:p>
+          <w:pPr>
+            <w:pStyle w:val="TOC2"/>
+            <w:tabs>
+              <w:tab w:val="right" w:leader="dot" w:pos="9350"/>
+            </w:tabs>
+            <w:rPr>
+              <w:noProof/>
+            </w:rPr>
+          </w:pPr>
+          <w:hyperlink w:anchor="_Toc224840312" w:history="1">
+            <w:r>
+              <w:rPr>
+                <w:rStyle w:val="Hyperlink"/>
+                <w:rFonts w:eastAsia="Times New Roman"/>
+                <w:noProof/>
+                <w:lang w:val="en-US"/>
+              </w:rPr>
+              <w:t>1. Generate Keystore (CRITICAL - Do This First!)</w:t>
+            </w:r>
+            <w:r>
+              <w:rPr>
+                <w:noProof/>
+                <w:webHidden/>
+              </w:rPr>
+              <w:tab/>
+            </w:r>
+            <w:r>
+              <w:rPr>
+                <w:noProof/>
+                <w:webHidden/>
+              </w:rPr>
+              <w:fldChar w:fldCharType="begin"/>
+            </w:r>
+            <w:r>
+              <w:rPr>
+                <w:noProof/>
+                <w:webHidden/>
+              </w:rPr>
+              <w:instrText xml:space="preserve"> PAGEREF _Toc224840312 \h </w:instrText>
+            </w:r>
+            <w:r>
+              <w:rPr>
+                <w:noProof/>
+                <w:webHidden/>
+              </w:rPr>
+            </w:r>
+            <w:r>
+              <w:rPr>
+                <w:noProof/>
+                <w:webHidden/>
+              </w:rPr>
+              <w:fldChar w:fldCharType="separate"/>
+            </w:r>
+            <w:r>
+              <w:rPr>
+                <w:noProof/>
+                <w:webHidden/>
+              </w:rPr>
+              <w:t>1</w:t>
+            </w:r>
+            <w:r>
+              <w:rPr>
+                <w:noProof/>
+                <w:webHidden/>
+              </w:rPr>
+              <w:fldChar w:fldCharType="end"/>
+            </w:r>
+          </w:hyperlink>
+        </w:p>
+        <w:p>
+          <w:pPr>
+            <w:pStyle w:val="TOC2"/>
+            <w:tabs>
+              <w:tab w:val="right" w:leader="dot" w:pos="9350"/>
+            </w:tabs>
+            <w:rPr>
+              <w:noProof/>
+            </w:rPr>
+          </w:pPr>
+          <w:hyperlink w:anchor="_Toc224840313" w:history="1">
+            <w:r>
+              <w:rPr>
+                <w:rStyle w:val="Hyperlink"/>
+                <w:rFonts w:eastAsia="Times New Roman"/>
+                <w:noProof/>
+                <w:lang w:val="en-US"/>
+              </w:rPr>
+              <w:t>2. Update Keystore Passwords in Project</w:t>
+            </w:r>
+            <w:r>
+              <w:rPr>
+                <w:noProof/>
+                <w:webHidden/>
+              </w:rPr>
+              <w:tab/>
+            </w:r>
+            <w:r>
+              <w:rPr>
+                <w:noProof/>
+                <w:webHidden/>
+              </w:rPr>
+              <w:fldChar w:fldCharType="begin"/>
+            </w:r>
+            <w:r>
+              <w:rPr>
+                <w:noProof/>
+                <w:webHidden/>
+              </w:rPr>
+              <w:instrText xml:space="preserve"> PAGEREF _Toc224840313 \h </w:instrText>
+            </w:r>
+            <w:r>
+              <w:rPr>
+                <w:noProof/>
+                <w:webHidden/>
+              </w:rPr>
+            </w:r>
+            <w:r>
+              <w:rPr>
+                <w:noProof/>
+                <w:webHidden/>
+              </w:rPr>
+              <w:fldChar w:fldCharType="separate"/>
+            </w:r>
+            <w:r>
+              <w:rPr>
+                <w:noProof/>
+                <w:webHidden/>
+              </w:rPr>
+              <w:t>1</w:t>
+            </w:r>
+            <w:r>
+              <w:rPr>
+                <w:noProof/>
+                <w:webHidden/>
+              </w:rPr>
+              <w:fldChar w:fldCharType="end"/>
+            </w:r>
+          </w:hyperlink>
+        </w:p>
+        <w:p>
+          <w:pPr>
+            <w:pStyle w:val="TOC2"/>
+            <w:tabs>
+              <w:tab w:val="right" w:leader="dot" w:pos="9350"/>
+            </w:tabs>
+            <w:rPr>
+              <w:noProof/>
+            </w:rPr>
+          </w:pPr>
+          <w:hyperlink w:anchor="_Toc224840314" w:history="1">
+            <w:r>
+              <w:rPr>
+                <w:rStyle w:val="Hyperlink"/>
+                <w:rFonts w:eastAsia="Times New Roman"/>
+                <w:noProof/>
+                <w:lang w:val="en-US"/>
+              </w:rPr>
+              <w:t>3. Create Store Assets</w:t>
+            </w:r>
+            <w:r>
+              <w:rPr>
+                <w:noProof/>
+                <w:webHidden/>
+              </w:rPr>
+              <w:tab/>
+            </w:r>
+            <w:r>
+              <w:rPr>
+                <w:noProof/>
+                <w:webHidden/>
+              </w:rPr>
+              <w:fldChar w:fldCharType="begin"/>
+            </w:r>
+            <w:r>
+              <w:rPr>
+                <w:noProof/>
+                <w:webHidden/>
+              </w:rPr>
+              <w:instrText xml:space="preserve"> PAGEREF _Toc224840314 \h </w:instrText>
+            </w:r>
+            <w:r>
+              <w:rPr>
+                <w:noProof/>
+                <w:webHidden/>
+              </w:rPr>
+            </w:r>
+            <w:r>
+              <w:rPr>
+                <w:noProof/>
+                <w:webHidden/>
+              </w:rPr>
+              <w:fldChar w:fldCharType="separate"/>
+            </w:r>
+            <w:r>
+              <w:rPr>
+                <w:noProof/>
+                <w:webHidden/>
+              </w:rPr>
+              <w:t>2</w:t>
+            </w:r>
+            <w:r>
+              <w:rPr>
+                <w:noProof/>
+                <w:webHidden/>
+              </w:rPr>
+              <w:fldChar w:fldCharType="end"/>
+            </w:r>
+          </w:hyperlink>
+        </w:p>
+        <w:p>
+          <w:pPr>
+            <w:pStyle w:val="TOC2"/>
+            <w:tabs>
+              <w:tab w:val="right" w:leader="dot" w:pos="9350"/>
+            </w:tabs>
+            <w:rPr>
+              <w:noProof/>
+            </w:rPr>
+          </w:pPr>
+          <w:hyperlink w:anchor="_Toc224840315" w:history="1">
+            <w:r>
+              <w:rPr>
+                <w:rStyle w:val="Hyperlink"/>
+                <w:rFonts w:eastAsia="Times New Roman"/>
+                <w:noProof/>
+                <w:lang w:val="en-US"/>
+              </w:rPr>
+              <w:t>4. Host Privacy Policy</w:t>
+            </w:r>
+            <w:r>
+              <w:rPr>
+                <w:noProof/>
+                <w:webHidden/>
+              </w:rPr>
+              <w:tab/>
+            </w:r>
+            <w:r>
+              <w:rPr>
+                <w:noProof/>
+                <w:webHidden/>
+              </w:rPr>
+              <w:fldChar w:fldCharType="begin"/>
+            </w:r>
+            <w:r>
+              <w:rPr>
+                <w:noProof/>
+                <w:webHidden/>
+              </w:rPr>
+              <w:instrText xml:space="preserve"> PAGEREF _Toc224840315 \h </w:instrText>
+            </w:r>
+            <w:r>
+              <w:rPr>
+                <w:noProof/>
+                <w:webHidden/>
+              </w:rPr>
+            </w:r>
+            <w:r>
+              <w:rPr>
+                <w:noProof/>
+                <w:webHidden/>
+              </w:rPr>
+              <w:fldChar w:fldCharType="separate"/>
+            </w:r>
+            <w:r>
+              <w:rPr>
+                <w:noProof/>
+                <w:webHidden/>
+              </w:rPr>
+              <w:t>2</w:t>
+            </w:r>
+            <w:r>
+              <w:rPr>
+                <w:noProof/>
+                <w:webHidden/>
+              </w:rPr>
+              <w:fldChar w:fldCharType="end"/>
+            </w:r>
+          </w:hyperlink>
+        </w:p>
+        <w:p>
+          <w:pPr>
+            <w:pStyle w:val="TOC2"/>
+            <w:tabs>
+              <w:tab w:val="right" w:leader="dot" w:pos="9350"/>
+            </w:tabs>
+            <w:rPr>
+              <w:noProof/>
+            </w:rPr>
+          </w:pPr>
+          <w:hyperlink w:anchor="_Toc224840316" w:history="1">
+            <w:r>
+              <w:rPr>
+                <w:rStyle w:val="Hyperlink"/>
+                <w:noProof/>
+                <w:lang w:val="en-US"/>
+              </w:rPr>
+              <w:t>5. Build Release AAB</w:t>
+            </w:r>
+            <w:r>
+              <w:rPr>
+                <w:noProof/>
+                <w:webHidden/>
+              </w:rPr>
+              <w:tab/>
+            </w:r>
+            <w:r>
+              <w:rPr>
+                <w:noProof/>
+                <w:webHidden/>
+              </w:rPr>
+              <w:fldChar w:fldCharType="begin"/>
+            </w:r>
+            <w:r>
+              <w:rPr>
+                <w:noProof/>
+                <w:webHidden/>
+              </w:rPr>
+              <w:instrText xml:space="preserve"> PAGEREF _Toc224840316 \h </w:instrText>
+            </w:r>
+            <w:r>
+              <w:rPr>
+                <w:noProof/>
+                <w:webHidden/>
+              </w:rPr>
+            </w:r>
+            <w:r>
+              <w:rPr>
+                <w:noProof/>
+                <w:webHidden/>
+              </w:rPr>
+              <w:fldChar w:fldCharType="separate"/>
+            </w:r>
+            <w:r>
+              <w:rPr>
+                <w:noProof/>
+                <w:webHidden/>
+              </w:rPr>
+              <w:t>2</w:t>
+            </w:r>
+            <w:r>
+              <w:rPr>
+                <w:noProof/>
+                <w:webHidden/>
+              </w:rPr>
+              <w:fldChar w:fldCharType="end"/>
+            </w:r>
+          </w:hyperlink>
+        </w:p>
+        <w:p>
+          <w:pPr>
+            <w:pStyle w:val="TOC2"/>
+            <w:tabs>
+              <w:tab w:val="right" w:leader="dot" w:pos="9350"/>
+            </w:tabs>
+            <w:rPr>
+              <w:noProof/>
+            </w:rPr>
+          </w:pPr>
+          <w:hyperlink w:anchor="_Toc224840317" w:history="1">
+            <w:r>
+              <w:rPr>
+                <w:rStyle w:val="Hyperlink"/>
+                <w:noProof/>
+                <w:lang w:val="en-US"/>
+              </w:rPr>
+              <w:t>6. Test Release Build</w:t>
+            </w:r>
+            <w:r>
+              <w:rPr>
+                <w:noProof/>
+                <w:webHidden/>
+              </w:rPr>
+              <w:tab/>
+            </w:r>
+            <w:r>
+              <w:rPr>
+                <w:noProof/>
+                <w:webHidden/>
+              </w:rPr>
+              <w:fldChar w:fldCharType="begin"/>
+            </w:r>
+            <w:r>
+              <w:rPr>
+                <w:noProof/>
+                <w:webHidden/>
+              </w:rPr>
+              <w:instrText xml:space="preserve"> PAGEREF _Toc224840317 \h </w:instrText>
+            </w:r>
+            <w:r>
+              <w:rPr>
+                <w:noProof/>
+                <w:webHidden/>
+              </w:rPr>
+            </w:r>
+            <w:r>
+              <w:rPr>
+                <w:noProof/>
+                <w:webHidden/>
+              </w:rPr>
+              <w:fldChar w:fldCharType="separate"/>
+            </w:r>
+            <w:r>
+              <w:rPr>
+                <w:noProof/>
+                <w:webHidden/>
+              </w:rPr>
+              <w:t>2</w:t>
+            </w:r>
+            <w:r>
+              <w:rPr>
+                <w:noProof/>
+                <w:webHidden/>
+              </w:rPr>
+              <w:fldChar w:fldCharType="end"/>
+            </w:r>
+          </w:hyperlink>
+        </w:p>
+        <w:p>
+          <w:pPr>
+            <w:pStyle w:val="TOC2"/>
+            <w:tabs>
+              <w:tab w:val="right" w:leader="dot" w:pos="9350"/>
+            </w:tabs>
+            <w:rPr>
+              <w:noProof/>
+            </w:rPr>
+          </w:pPr>
+          <w:hyperlink w:anchor="_Toc224840318" w:history="1">
+            <w:r>
+              <w:rPr>
+                <w:rStyle w:val="Hyperlink"/>
+                <w:rFonts w:eastAsia="Times New Roman"/>
+                <w:noProof/>
+                <w:lang w:val="en-US"/>
+              </w:rPr>
+              <w:t>7. Create Google Play Console Account</w:t>
+            </w:r>
+            <w:r>
+              <w:rPr>
+                <w:noProof/>
+                <w:webHidden/>
+              </w:rPr>
+              <w:tab/>
+            </w:r>
+            <w:r>
+              <w:rPr>
+                <w:noProof/>
+                <w:webHidden/>
+              </w:rPr>
+              <w:fldChar w:fldCharType="begin"/>
+            </w:r>
+            <w:r>
+              <w:rPr>
+                <w:noProof/>
+                <w:webHidden/>
+              </w:rPr>
+              <w:instrText xml:space="preserve"> PAGEREF _Toc224840318 \h </w:instrText>
+            </w:r>
+            <w:r>
+              <w:rPr>
+                <w:noProof/>
+                <w:webHidden/>
+              </w:rPr>
+            </w:r>
+            <w:r>
+              <w:rPr>
+                <w:noProof/>
+                <w:webHidden/>
+              </w:rPr>
+              <w:fldChar w:fldCharType="separate"/>
+            </w:r>
+            <w:r>
+              <w:rPr>
+                <w:noProof/>
+                <w:webHidden/>
+              </w:rPr>
+              <w:t>2</w:t>
+            </w:r>
+            <w:r>
+              <w:rPr>
+                <w:noProof/>
+                <w:webHidden/>
+              </w:rPr>
+              <w:fldChar w:fldCharType="end"/>
+            </w:r>
+          </w:hyperlink>
+        </w:p>
+        <w:p>
+          <w:pPr>
+            <w:pStyle w:val="TOC2"/>
+            <w:tabs>
+              <w:tab w:val="right" w:leader="dot" w:pos="9350"/>
+            </w:tabs>
+            <w:rPr>
+              <w:noProof/>
+            </w:rPr>
+          </w:pPr>
+          <w:hyperlink w:anchor="_Toc224840319" w:history="1">
+            <w:r>
+              <w:rPr>
+                <w:rStyle w:val="Hyperlink"/>
+                <w:rFonts w:eastAsia="Times New Roman"/>
+                <w:noProof/>
+                <w:lang w:val="en-US"/>
+              </w:rPr>
+              <w:t>8. Upload to Play Console</w:t>
+            </w:r>
+            <w:r>
+              <w:rPr>
+                <w:noProof/>
+                <w:webHidden/>
+              </w:rPr>
+              <w:tab/>
+            </w:r>
+            <w:r>
+              <w:rPr>
+                <w:noProof/>
+                <w:webHidden/>
+              </w:rPr>
+              <w:fldChar w:fldCharType="begin"/>
+            </w:r>
+            <w:r>
+              <w:rPr>
+                <w:noProof/>
+                <w:webHidden/>
+              </w:rPr>
+              <w:instrText xml:space="preserve"> PAGEREF _Toc224840319 \h </w:instrText>
+            </w:r>
+            <w:r>
+              <w:rPr>
+                <w:noProof/>
+                <w:webHidden/>
+              </w:rPr>
+            </w:r>
+            <w:r>
+              <w:rPr>
+                <w:noProof/>
+                <w:webHidden/>
+              </w:rPr>
+              <w:fldChar w:fldCharType="separate"/>
+            </w:r>
+            <w:r>
+              <w:rPr>
+                <w:noProof/>
+                <w:webHidden/>
+              </w:rPr>
+              <w:t>3</w:t>
+            </w:r>
+            <w:r>
+              <w:rPr>
+                <w:noProof/>
+                <w:webHidden/>
+              </w:rPr>
+              <w:fldChar w:fldCharType="end"/>
+            </w:r>
+          </w:hyperlink>
+        </w:p>
+        <w:p>
+          <w:pPr>
+            <w:pStyle w:val="TOC1"/>
+            <w:tabs>
+              <w:tab w:val="right" w:leader="dot" w:pos="9350"/>
+            </w:tabs>
+            <w:rPr>
+              <w:noProof/>
+            </w:rPr>
+          </w:pPr>
+          <w:hyperlink w:anchor="_Toc224840320" w:history="1">
+            <w:r>
+              <w:rPr>
+                <w:rStyle w:val="Hyperlink"/>
+                <w:rFonts w:ascii="Segoe UI Emoji" w:eastAsia="Times New Roman" w:hAnsi="Segoe UI Emoji" w:cs="Segoe UI Emoji"/>
+                <w:noProof/>
+                <w:lang w:val="en-US"/>
+              </w:rPr>
+              <w:t>⚠️</w:t>
+            </w:r>
+            <w:r>
+              <w:rPr>
+                <w:rStyle w:val="Hyperlink"/>
+                <w:rFonts w:eastAsia="Times New Roman"/>
+                <w:noProof/>
+                <w:lang w:val="en-US"/>
+              </w:rPr>
+              <w:t xml:space="preserve"> CRITICAL REMINDERS</w:t>
+            </w:r>
+            <w:r>
+              <w:rPr>
+                <w:noProof/>
+                <w:webHidden/>
+              </w:rPr>
+              <w:tab/>
+            </w:r>
+            <w:r>
+              <w:rPr>
+                <w:noProof/>
+                <w:webHidden/>
+              </w:rPr>
+              <w:fldChar w:fldCharType="begin"/>
+            </w:r>
+            <w:r>
+              <w:rPr>
+                <w:noProof/>
+                <w:webHidden/>
+              </w:rPr>
+              <w:instrText xml:space="preserve"> PAGEREF _Toc224840320 \h </w:instrText>
+            </w:r>
+            <w:r>
+              <w:rPr>
+                <w:noProof/>
+                <w:webHidden/>
+              </w:rPr>
+            </w:r>
+            <w:r>
+              <w:rPr>
+                <w:noProof/>
+                <w:webHidden/>
+              </w:rPr>
+              <w:fldChar w:fldCharType="separate"/>
+            </w:r>
+            <w:r>
+              <w:rPr>
+                <w:noProof/>
+                <w:webHidden/>
+              </w:rPr>
+              <w:t>3</w:t>
+            </w:r>
+            <w:r>
+              <w:rPr>
+                <w:noProof/>
+                <w:webHidden/>
+              </w:rPr>
+              <w:fldChar w:fldCharType="end"/>
+            </w:r>
+          </w:hyperlink>
+        </w:p>
+        <w:p>
+          <w:pPr>
+            <w:pStyle w:val="TOC1"/>
+            <w:tabs>
+              <w:tab w:val="right" w:leader="dot" w:pos="9350"/>
+            </w:tabs>
+            <w:rPr>
+              <w:noProof/>
+            </w:rPr>
+          </w:pPr>
+          <w:hyperlink w:anchor="_Toc224840321" w:history="1">
+            <w:r>
+              <w:rPr>
+                <w:rStyle w:val="Hyperlink"/>
+                <w:rFonts w:ascii="Segoe UI Emoji" w:eastAsia="Times New Roman" w:hAnsi="Segoe UI Emoji" w:cs="Segoe UI Emoji"/>
+                <w:noProof/>
+                <w:lang w:val="en-US"/>
+              </w:rPr>
+              <w:t>🆘</w:t>
+            </w:r>
+            <w:r>
+              <w:rPr>
+                <w:rStyle w:val="Hyperlink"/>
+                <w:rFonts w:eastAsia="Times New Roman"/>
+                <w:noProof/>
+                <w:lang w:val="en-US"/>
+              </w:rPr>
+              <w:t xml:space="preserve"> If You Get Stuck</w:t>
+            </w:r>
+            <w:r>
+              <w:rPr>
+                <w:noProof/>
+                <w:webHidden/>
+              </w:rPr>
+              <w:tab/>
+            </w:r>
+            <w:r>
+              <w:rPr>
+                <w:noProof/>
+                <w:webHidden/>
+              </w:rPr>
+              <w:fldChar w:fldCharType="begin"/>
+            </w:r>
+            <w:r>
+              <w:rPr>
+                <w:noProof/>
+                <w:webHidden/>
+              </w:rPr>
+              <w:instrText xml:space="preserve"> PAGEREF _Toc224840321 \h </w:instrText>
+            </w:r>
+            <w:r>
+              <w:rPr>
+                <w:noProof/>
+                <w:webHidden/>
+              </w:rPr>
+            </w:r>
+            <w:r>
+              <w:rPr>
+                <w:noProof/>
+                <w:webHidden/>
+              </w:rPr>
+              <w:fldChar w:fldCharType="separate"/>
+            </w:r>
+            <w:r>
+              <w:rPr>
+                <w:noProof/>
+                <w:webHidden/>
+              </w:rPr>
+              <w:t>3</w:t>
+            </w:r>
+            <w:r>
+              <w:rPr>
+                <w:noProof/>
+                <w:webHidden/>
+              </w:rPr>
+              <w:fldChar w:fldCharType="end"/>
+            </w:r>
+          </w:hyperlink>
+        </w:p>
+        <w:p>
+          <w:pPr>
+            <w:pStyle w:val="TOC1"/>
+            <w:tabs>
+              <w:tab w:val="right" w:leader="dot" w:pos="9350"/>
+            </w:tabs>
+            <w:rPr>
+              <w:noProof/>
+            </w:rPr>
+          </w:pPr>
+          <w:hyperlink w:anchor="_Toc224840322" w:history="1">
+            <w:r>
+              <w:rPr>
+                <w:rStyle w:val="Hyperlink"/>
+                <w:rFonts w:ascii="Segoe UI Emoji" w:eastAsia="Times New Roman" w:hAnsi="Segoe UI Emoji" w:cs="Segoe UI Emoji"/>
+                <w:noProof/>
+                <w:lang w:val="en-US"/>
+              </w:rPr>
+              <w:t>📊</w:t>
+            </w:r>
+            <w:r>
+              <w:rPr>
+                <w:rStyle w:val="Hyperlink"/>
+                <w:rFonts w:eastAsia="Times New Roman"/>
+                <w:noProof/>
+                <w:lang w:val="en-US"/>
+              </w:rPr>
+              <w:t xml:space="preserve"> Estimated Timeline</w:t>
+            </w:r>
+            <w:r>
+              <w:rPr>
+                <w:noProof/>
+                <w:webHidden/>
+              </w:rPr>
+              <w:tab/>
+            </w:r>
+            <w:r>
+              <w:rPr>
+                <w:noProof/>
+                <w:webHidden/>
+              </w:rPr>
+              <w:fldChar w:fldCharType="begin"/>
+            </w:r>
+            <w:r>
+              <w:rPr>
+                <w:noProof/>
+                <w:webHidden/>
+              </w:rPr>
+              <w:instrText xml:space="preserve"> PAGEREF _Toc224840322 \h </w:instrText>
+            </w:r>
+            <w:r>
+              <w:rPr>
+                <w:noProof/>
+                <w:webHidden/>
+              </w:rPr>
+            </w:r>
+            <w:r>
+              <w:rPr>
+                <w:noProof/>
+                <w:webHidden/>
+              </w:rPr>
+              <w:fldChar w:fldCharType="separate"/>
+            </w:r>
+            <w:r>
+              <w:rPr>
+                <w:noProof/>
+                <w:webHidden/>
+              </w:rPr>
+              <w:t>3</w:t>
+            </w:r>
+            <w:r>
+              <w:rPr>
+                <w:noProof/>
+                <w:webHidden/>
+              </w:rPr>
+              <w:fldChar w:fldCharType="end"/>
+            </w:r>
+          </w:hyperlink>
+        </w:p>
+        <w:p>
+          <w:pPr>
+            <w:pStyle w:val="TOC1"/>
+            <w:tabs>
+              <w:tab w:val="right" w:leader="dot" w:pos="9350"/>
+            </w:tabs>
+            <w:rPr>
+              <w:noProof/>
+            </w:rPr>
+          </w:pPr>
+          <w:hyperlink w:anchor="_Toc224840323" w:history="1">
+            <w:r>
+              <w:rPr>
+                <w:rStyle w:val="Hyperlink"/>
+                <w:rFonts w:ascii="Segoe UI Emoji" w:eastAsia="Times New Roman" w:hAnsi="Segoe UI Emoji" w:cs="Segoe UI Emoji"/>
+                <w:noProof/>
+                <w:lang w:val="en-US"/>
+              </w:rPr>
+              <w:t>🎉</w:t>
+            </w:r>
+            <w:r>
+              <w:rPr>
+                <w:rStyle w:val="Hyperlink"/>
+                <w:rFonts w:eastAsia="Times New Roman"/>
+                <w:noProof/>
+                <w:lang w:val="en-US"/>
+              </w:rPr>
+              <w:t xml:space="preserve"> You're Ready!</w:t>
+            </w:r>
+            <w:r>
+              <w:rPr>
+                <w:noProof/>
+                <w:webHidden/>
+              </w:rPr>
+              <w:tab/>
+            </w:r>
+            <w:r>
+              <w:rPr>
+                <w:noProof/>
+                <w:webHidden/>
+              </w:rPr>
+              <w:fldChar w:fldCharType="begin"/>
+            </w:r>
+            <w:r>
+              <w:rPr>
+                <w:noProof/>
+                <w:webHidden/>
+              </w:rPr>
+              <w:instrText xml:space="preserve"> PAGEREF _Toc224840323 \h </w:instrText>
+            </w:r>
+            <w:r>
+              <w:rPr>
+                <w:noProof/>
+                <w:webHidden/>
+              </w:rPr>
+            </w:r>
+            <w:r>
+              <w:rPr>
+                <w:noProof/>
+                <w:webHidden/>
+              </w:rPr>
+              <w:fldChar w:fldCharType="separate"/>
+            </w:r>
+            <w:r>
+              <w:rPr>
+                <w:noProof/>
+                <w:webHidden/>
+              </w:rPr>
+              <w:t>3</w:t>
+            </w:r>
+            <w:r>
+              <w:rPr>
+                <w:noProof/>
+                <w:webHidden/>
+              </w:rPr>
+              <w:fldChar w:fldCharType="end"/>
+            </w:r>
+          </w:hyperlink>
+        </w:p>
+        <w:p>
+          <w:r>
+            <w:rPr>
+              <w:b/>
+              <w:bCs/>
+              <w:noProof/>
+            </w:rPr>
+            <w:fldChar w:fldCharType="end"/>
+          </w:r>
+        </w:p>
+      </w:sdtContent>
+    </w:sdt>
     <w:p>
       <w:pPr>
         <w:autoSpaceDE w:val="0"/>
@@ -9,68 +1012,56 @@
         <w:adjustRightInd w:val="0"/>
         <w:spacing w:after="0" w:line="240" w:lineRule="auto"/>
         <w:rPr>
-          <w:rFonts w:ascii="Segoe UI" w:eastAsia="Times New Roman" w:hAnsi="Segoe UI" w:cs="Segoe UI"/>
+          <w:rFonts w:ascii="Segoe UI Emoji" w:eastAsia="Times New Roman" w:hAnsi="Segoe UI Emoji" w:cs="Segoe UI Emoji"/>
           <w:color w:val="1E1E1E"/>
           <w:sz w:val="24"/>
           <w:szCs w:val="24"/>
           <w:lang w:val="en-US"/>
         </w:rPr>
       </w:pPr>
+    </w:p>
+    <w:p>
+      <w:pPr>
+        <w:pStyle w:val="Heading1"/>
+        <w:rPr>
+          <w:rFonts w:eastAsia="Times New Roman"/>
+          <w:lang w:val="en-US"/>
+        </w:rPr>
+      </w:pPr>
+      <w:bookmarkStart w:id="0" w:name="_Toc224840311"/>
       <w:r>
         <w:rPr>
           <w:rFonts w:ascii="Segoe UI Emoji" w:eastAsia="Times New Roman" w:hAnsi="Segoe UI Emoji" w:cs="Segoe UI Emoji"/>
-          <w:color w:val="1E1E1E"/>
-          <w:sz w:val="24"/>
-          <w:szCs w:val="24"/>
           <w:lang w:val="en-US"/>
         </w:rPr>
         <w:t>🔑</w:t>
       </w:r>
       <w:r>
         <w:rPr>
-          <w:rFonts w:ascii="Segoe UI" w:eastAsia="Times New Roman" w:hAnsi="Segoe UI" w:cs="Segoe UI"/>
-          <w:color w:val="1E1E1E"/>
-          <w:sz w:val="24"/>
-          <w:szCs w:val="24"/>
-          <w:lang w:val="en-US"/>
-        </w:rPr>
-        <w:t xml:space="preserve"> </w:t>
-      </w:r>
-      <w:r>
-        <w:rPr>
-          <w:rFonts w:ascii="Segoe UI" w:eastAsia="Times New Roman" w:hAnsi="Segoe UI" w:cs="Segoe UI"/>
-          <w:b/>
-          <w:color w:val="1E1E1E"/>
-          <w:sz w:val="24"/>
-          <w:szCs w:val="24"/>
-          <w:lang w:val="en-US"/>
-        </w:rPr>
-        <w:t>NEXT STEPS (In Order)</w:t>
-      </w:r>
-    </w:p>
-    <w:p>
-      <w:pPr>
-        <w:autoSpaceDE w:val="0"/>
-        <w:autoSpaceDN w:val="0"/>
-        <w:adjustRightInd w:val="0"/>
-        <w:spacing w:after="0" w:line="240" w:lineRule="auto"/>
-        <w:rPr>
-          <w:rFonts w:ascii="Segoe UI" w:eastAsia="Times New Roman" w:hAnsi="Segoe UI" w:cs="Times New Roman"/>
-          <w:color w:val="1E1E1E"/>
-          <w:szCs w:val="18"/>
-          <w:lang w:val="en-US"/>
-        </w:rPr>
-      </w:pPr>
-      <w:r>
-        <w:rPr>
-          <w:rFonts w:ascii="Segoe UI" w:eastAsia="Times New Roman" w:hAnsi="Segoe UI" w:cs="Times New Roman"/>
-          <w:b/>
-          <w:color w:val="1E1E1E"/>
-          <w:szCs w:val="18"/>
+          <w:rFonts w:eastAsia="Times New Roman"/>
+          <w:lang w:val="en-US"/>
+        </w:rPr>
+        <w:t xml:space="preserve"> NEXT STEPS (In Order)</w:t>
+      </w:r>
+      <w:bookmarkEnd w:id="0"/>
+    </w:p>
+    <w:p>
+      <w:pPr>
+        <w:pStyle w:val="Heading2"/>
+        <w:rPr>
+          <w:rFonts w:eastAsia="Times New Roman"/>
+          <w:lang w:val="en-US"/>
+        </w:rPr>
+      </w:pPr>
+      <w:bookmarkStart w:id="1" w:name="_Toc224840312"/>
+      <w:r>
+        <w:rPr>
+          <w:rFonts w:eastAsia="Times New Roman"/>
           <w:lang w:val="en-US"/>
         </w:rPr>
         <w:t>1. Generate Keystore (CRITICAL - Do This First!)</w:t>
       </w:r>
+      <w:bookmarkEnd w:id="1"/>
     </w:p>
     <w:p>
       <w:pPr>
@@ -362,17 +1353,130 @@
     </w:p>
     <w:p>
       <w:pPr>
+        <w:pStyle w:val="Heading2"/>
+        <w:rPr>
+          <w:rFonts w:eastAsia="Times New Roman"/>
+          <w:lang w:val="en-US"/>
+        </w:rPr>
+      </w:pPr>
+      <w:bookmarkStart w:id="2" w:name="_Toc224840313"/>
+      <w:r>
+        <w:rPr>
+          <w:rFonts w:eastAsia="Times New Roman"/>
+          <w:lang w:val="en-US"/>
+        </w:rPr>
+        <w:t>2. Update Keystore Passwords in Project</w:t>
+      </w:r>
+      <w:bookmarkEnd w:id="2"/>
+    </w:p>
+    <w:p>
+      <w:pPr>
         <w:autoSpaceDE w:val="0"/>
         <w:autoSpaceDN w:val="0"/>
         <w:adjustRightInd w:val="0"/>
         <w:spacing w:after="0" w:line="240" w:lineRule="auto"/>
         <w:rPr>
-          <w:rFonts w:ascii="Segoe UI" w:eastAsia="Times New Roman" w:hAnsi="Segoe UI" w:cs="Segoe UI"/>
-          <w:color w:val="1E1E1E"/>
-          <w:lang w:val="en-US"/>
-        </w:rPr>
-      </w:pPr>
-      <w:r>
+          <w:rFonts w:ascii="Segoe UI" w:eastAsia="Times New Roman" w:hAnsi="Segoe UI" w:cs="Times New Roman"/>
+          <w:color w:val="1E1E1E"/>
+          <w:sz w:val="18"/>
+          <w:szCs w:val="18"/>
+          <w:lang w:val="en-US"/>
+        </w:rPr>
+      </w:pPr>
+      <w:r>
+        <w:rPr>
+          <w:rFonts w:ascii="Segoe UI" w:eastAsia="Times New Roman" w:hAnsi="Segoe UI" w:cs="Times New Roman"/>
+          <w:color w:val="1E1E1E"/>
+          <w:sz w:val="18"/>
+          <w:szCs w:val="18"/>
+          <w:lang w:val="en-US"/>
+        </w:rPr>
+        <w:t xml:space="preserve">Edit </w:t>
+      </w:r>
+      <w:r>
+        <w:rPr>
+          <w:rFonts w:ascii="Segoe UI" w:eastAsia="Times New Roman" w:hAnsi="Segoe UI" w:cs="Times New Roman"/>
+          <w:color w:val="006CBE"/>
+          <w:sz w:val="20"/>
+          <w:szCs w:val="18"/>
+          <w:u w:val="single"/>
+          <w:lang w:val="en-US"/>
+        </w:rPr>
+        <w:t>TurfTime2.csproj</w:t>
+      </w:r>
+      <w:r>
+        <w:rPr>
+          <w:rFonts w:ascii="Segoe UI" w:eastAsia="Times New Roman" w:hAnsi="Segoe UI" w:cs="Times New Roman"/>
+          <w:color w:val="1E1E1E"/>
+          <w:sz w:val="18"/>
+          <w:szCs w:val="18"/>
+          <w:lang w:val="en-US"/>
+        </w:rPr>
+        <w:t xml:space="preserve"> (lines with passwords):</w:t>
+      </w:r>
+    </w:p>
+    <w:p>
+      <w:pPr>
+        <w:pStyle w:val="NoSpacing"/>
+        <w:rPr>
+          <w:lang w:val="en-US"/>
+        </w:rPr>
+      </w:pPr>
+      <w:r>
+        <w:rPr>
+          <w:lang w:val="en-US"/>
+        </w:rPr>
+        <w:t>&lt;AndroidSigningStorePass&gt;YOUR_KEYSTORE_PASSWORD&lt;/AndroidSigningStorePass&gt;</w:t>
+      </w:r>
+    </w:p>
+    <w:p>
+      <w:pPr>
+        <w:pStyle w:val="NoSpacing"/>
+        <w:rPr>
+          <w:lang w:val="en-US"/>
+        </w:rPr>
+      </w:pPr>
+      <w:r>
+        <w:rPr>
+          <w:lang w:val="en-US"/>
+        </w:rPr>
+        <w:t>&lt;</w:t>
+      </w:r>
+      <w:proofErr w:type="spellStart"/>
+      <w:r>
+        <w:rPr>
+          <w:lang w:val="en-US"/>
+        </w:rPr>
+        <w:t>AndroidSigningKeyPass</w:t>
+      </w:r>
+      <w:proofErr w:type="spellEnd"/>
+      <w:r>
+        <w:rPr>
+          <w:lang w:val="en-US"/>
+        </w:rPr>
+        <w:t>&gt;YOUR_KEY_PASSWORD&lt;/</w:t>
+      </w:r>
+      <w:proofErr w:type="spellStart"/>
+      <w:r>
+        <w:rPr>
+          <w:lang w:val="en-US"/>
+        </w:rPr>
+        <w:t>AndroidSigningKeyPass</w:t>
+      </w:r>
+      <w:proofErr w:type="spellEnd"/>
+      <w:r>
+        <w:rPr>
+          <w:lang w:val="en-US"/>
+        </w:rPr>
+        <w:t>&gt;</w:t>
+      </w:r>
+    </w:p>
+    <w:p>
+      <w:pPr>
+        <w:autoSpaceDE w:val="0"/>
+        <w:autoSpaceDN w:val="0"/>
+        <w:adjustRightInd w:val="0"/>
+        <w:spacing w:after="0" w:line="240" w:lineRule="auto"/>
         <w:rPr>
           <w:rFonts w:ascii="Segoe UI" w:eastAsia="Times New Roman" w:hAnsi="Segoe UI" w:cs="Segoe UI"/>
           <w:b/>
@@ -380,8 +1484,7 @@
           <w:color w:val="1E1E1E"/>
           <w:lang w:val="en-US"/>
         </w:rPr>
-        <w:t>2. Update Keystore Passwords in Project</w:t>
-      </w:r>
+      </w:pPr>
     </w:p>
     <w:p>
       <w:pPr>
@@ -390,44 +1493,49 @@
         <w:adjustRightInd w:val="0"/>
         <w:spacing w:after="0" w:line="240" w:lineRule="auto"/>
         <w:rPr>
-          <w:rFonts w:ascii="Segoe UI" w:eastAsia="Times New Roman" w:hAnsi="Segoe UI" w:cs="Times New Roman"/>
-          <w:color w:val="1E1E1E"/>
-          <w:sz w:val="18"/>
-          <w:szCs w:val="18"/>
-          <w:lang w:val="en-US"/>
-        </w:rPr>
-      </w:pPr>
-      <w:r>
-        <w:rPr>
-          <w:rFonts w:ascii="Segoe UI" w:eastAsia="Times New Roman" w:hAnsi="Segoe UI" w:cs="Times New Roman"/>
-          <w:color w:val="1E1E1E"/>
-          <w:sz w:val="18"/>
-          <w:szCs w:val="18"/>
-          <w:lang w:val="en-US"/>
-        </w:rPr>
-        <w:t xml:space="preserve">Edit </w:t>
-      </w:r>
-      <w:r>
-        <w:rPr>
-          <w:rFonts w:ascii="Segoe UI" w:eastAsia="Times New Roman" w:hAnsi="Segoe UI" w:cs="Times New Roman"/>
-          <w:color w:val="006CBE"/>
-          <w:sz w:val="20"/>
-          <w:szCs w:val="18"/>
-          <w:u w:val="single"/>
-          <w:lang w:val="en-US"/>
-        </w:rPr>
-        <w:t>TurfTime2.csproj</w:t>
-      </w:r>
-      <w:r>
-        <w:rPr>
-          <w:rFonts w:ascii="Segoe UI" w:eastAsia="Times New Roman" w:hAnsi="Segoe UI" w:cs="Times New Roman"/>
-          <w:color w:val="1E1E1E"/>
-          <w:sz w:val="18"/>
-          <w:szCs w:val="18"/>
-          <w:lang w:val="en-US"/>
-        </w:rPr>
-        <w:t xml:space="preserve"> (lines with passwords):</w:t>
-      </w:r>
+          <w:rFonts w:ascii="Segoe UI" w:hAnsi="Segoe UI" w:cs="Segoe UI"/>
+          <w:color w:val="1E1E1E"/>
+          <w:sz w:val="18"/>
+          <w:szCs w:val="18"/>
+          <w:lang w:val="en-US"/>
+        </w:rPr>
+      </w:pPr>
+      <w:r>
+        <w:rPr>
+          <w:rFonts w:ascii="Segoe UI" w:hAnsi="Segoe UI" w:cs="Segoe UI"/>
+          <w:b/>
+          <w:color w:val="1E1E1E"/>
+          <w:sz w:val="18"/>
+          <w:szCs w:val="18"/>
+          <w:lang w:val="en-US"/>
+        </w:rPr>
+        <w:t>OR use environment variables</w:t>
+      </w:r>
+      <w:r>
+        <w:rPr>
+          <w:rFonts w:ascii="Segoe UI" w:hAnsi="Segoe UI" w:cs="Segoe UI"/>
+          <w:color w:val="1E1E1E"/>
+          <w:sz w:val="18"/>
+          <w:szCs w:val="18"/>
+          <w:lang w:val="en-US"/>
+        </w:rPr>
+        <w:t xml:space="preserve"> (more secure):</w:t>
+      </w:r>
+    </w:p>
+    <w:p>
+      <w:pPr>
+        <w:autoSpaceDE w:val="0"/>
+        <w:autoSpaceDN w:val="0"/>
+        <w:adjustRightInd w:val="0"/>
+        <w:spacing w:after="0" w:line="240" w:lineRule="auto"/>
+        <w:rPr>
+          <w:rFonts w:ascii="Segoe UI" w:hAnsi="Segoe UI" w:cs="Segoe UI"/>
+          <w:color w:val="1E1E1E"/>
+          <w:sz w:val="18"/>
+          <w:szCs w:val="18"/>
+          <w:lang w:val="en-US"/>
+        </w:rPr>
+      </w:pPr>
     </w:p>
     <w:p>
       <w:pPr>
@@ -440,7 +1548,37 @@
         <w:rPr>
           <w:lang w:val="en-US"/>
         </w:rPr>
-        <w:t>&lt;AndroidSigningStorePass&gt;YOUR_KEYSTORE_PASSWORD&lt;/AndroidSigningStorePass&gt;</w:t>
+        <w:t>$</w:t>
+      </w:r>
+      <w:proofErr w:type="spellStart"/>
+      <w:proofErr w:type="gramStart"/>
+      <w:r>
+        <w:rPr>
+          <w:lang w:val="en-US"/>
+        </w:rPr>
+        <w:t>env:AndroidSigningStorePassword</w:t>
+      </w:r>
+      <w:proofErr w:type="spellEnd"/>
+      <w:proofErr w:type="gramEnd"/>
+      <w:r>
+        <w:rPr>
+          <w:lang w:val="en-US"/>
+        </w:rPr>
+        <w:t xml:space="preserve"> = "</w:t>
+      </w:r>
+      <w:proofErr w:type="spellStart"/>
+      <w:r>
+        <w:rPr>
+          <w:lang w:val="en-US"/>
+        </w:rPr>
+        <w:t>your_password</w:t>
+      </w:r>
+      <w:proofErr w:type="spellEnd"/>
+      <w:r>
+        <w:rPr>
+          <w:lang w:val="en-US"/>
+        </w:rPr>
+        <w:t>"</w:t>
       </w:r>
     </w:p>
     <w:p>
@@ -454,35 +1592,38 @@
         <w:rPr>
           <w:lang w:val="en-US"/>
         </w:rPr>
-        <w:t>&lt;</w:t>
+        <w:lastRenderedPageBreak/>
+        <w:t>$</w:t>
       </w:r>
       <w:proofErr w:type="spellStart"/>
-      <w:r>
-        <w:rPr>
-          <w:lang w:val="en-US"/>
-        </w:rPr>
-        <w:t>AndroidSigningKeyPass</w:t>
+      <w:proofErr w:type="gramStart"/>
+      <w:r>
+        <w:rPr>
+          <w:lang w:val="en-US"/>
+        </w:rPr>
+        <w:t>env:AndroidSigningKeyPassword</w:t>
       </w:r>
       <w:proofErr w:type="spellEnd"/>
-      <w:r>
-        <w:rPr>
-          <w:lang w:val="en-US"/>
-        </w:rPr>
-        <w:t>&gt;YOUR_KEY_PASSWORD&lt;/</w:t>
+      <w:proofErr w:type="gramEnd"/>
+      <w:r>
+        <w:rPr>
+          <w:lang w:val="en-US"/>
+        </w:rPr>
+        <w:t xml:space="preserve"> = "</w:t>
       </w:r>
       <w:proofErr w:type="spellStart"/>
       <w:r>
         <w:rPr>
           <w:lang w:val="en-US"/>
         </w:rPr>
-        <w:t>AndroidSigningKeyPass</w:t>
+        <w:t>your_password</w:t>
       </w:r>
       <w:proofErr w:type="spellEnd"/>
       <w:r>
         <w:rPr>
           <w:lang w:val="en-US"/>
         </w:rPr>
-        <w:t>&gt;</w:t>
+        <w:t>"</w:t>
       </w:r>
     </w:p>
     <w:p>
@@ -502,180 +1643,21 @@
     </w:p>
     <w:p>
       <w:pPr>
-        <w:autoSpaceDE w:val="0"/>
-        <w:autoSpaceDN w:val="0"/>
-        <w:adjustRightInd w:val="0"/>
-        <w:spacing w:after="0" w:line="240" w:lineRule="auto"/>
-        <w:rPr>
-          <w:rFonts w:ascii="Segoe UI" w:hAnsi="Segoe UI" w:cs="Segoe UI"/>
-          <w:color w:val="1E1E1E"/>
-          <w:sz w:val="18"/>
-          <w:szCs w:val="18"/>
-          <w:lang w:val="en-US"/>
-        </w:rPr>
-      </w:pPr>
-      <w:r>
-        <w:rPr>
-          <w:rFonts w:ascii="Segoe UI" w:hAnsi="Segoe UI" w:cs="Segoe UI"/>
-          <w:b/>
-          <w:color w:val="1E1E1E"/>
-          <w:sz w:val="18"/>
-          <w:szCs w:val="18"/>
-          <w:lang w:val="en-US"/>
-        </w:rPr>
-        <w:t>OR use environment variables</w:t>
-      </w:r>
-      <w:r>
-        <w:rPr>
-          <w:rFonts w:ascii="Segoe UI" w:hAnsi="Segoe UI" w:cs="Segoe UI"/>
-          <w:color w:val="1E1E1E"/>
-          <w:sz w:val="18"/>
-          <w:szCs w:val="18"/>
-          <w:lang w:val="en-US"/>
-        </w:rPr>
-        <w:t xml:space="preserve"> (more secure):</w:t>
-      </w:r>
-    </w:p>
-    <w:p>
-      <w:pPr>
-        <w:autoSpaceDE w:val="0"/>
-        <w:autoSpaceDN w:val="0"/>
-        <w:adjustRightInd w:val="0"/>
-        <w:spacing w:after="0" w:line="240" w:lineRule="auto"/>
-        <w:rPr>
-          <w:rFonts w:ascii="Segoe UI" w:hAnsi="Segoe UI" w:cs="Segoe UI"/>
-          <w:color w:val="1E1E1E"/>
-          <w:sz w:val="18"/>
-          <w:szCs w:val="18"/>
-          <w:lang w:val="en-US"/>
-        </w:rPr>
-      </w:pPr>
-    </w:p>
-    <w:p>
-      <w:pPr>
-        <w:pStyle w:val="NoSpacing"/>
-        <w:rPr>
-          <w:lang w:val="en-US"/>
-        </w:rPr>
-      </w:pPr>
-      <w:r>
-        <w:rPr>
-          <w:lang w:val="en-US"/>
-        </w:rPr>
-        <w:t>$</w:t>
-      </w:r>
-      <w:proofErr w:type="spellStart"/>
-      <w:proofErr w:type="gramStart"/>
-      <w:r>
-        <w:rPr>
-          <w:lang w:val="en-US"/>
-        </w:rPr>
-        <w:t>env:AndroidSigningStorePassword</w:t>
-      </w:r>
-      <w:proofErr w:type="spellEnd"/>
-      <w:proofErr w:type="gramEnd"/>
-      <w:r>
-        <w:rPr>
-          <w:lang w:val="en-US"/>
-        </w:rPr>
-        <w:t xml:space="preserve"> = "</w:t>
-      </w:r>
-      <w:proofErr w:type="spellStart"/>
-      <w:r>
-        <w:rPr>
-          <w:lang w:val="en-US"/>
-        </w:rPr>
-        <w:t>your_password</w:t>
-      </w:r>
-      <w:proofErr w:type="spellEnd"/>
-      <w:r>
-        <w:rPr>
-          <w:lang w:val="en-US"/>
-        </w:rPr>
-        <w:t>"</w:t>
-      </w:r>
-    </w:p>
-    <w:p>
-      <w:pPr>
-        <w:pStyle w:val="NoSpacing"/>
-        <w:rPr>
-          <w:lang w:val="en-US"/>
-        </w:rPr>
-      </w:pPr>
-      <w:r>
-        <w:rPr>
-          <w:lang w:val="en-US"/>
-        </w:rPr>
-        <w:t>$</w:t>
-      </w:r>
-      <w:proofErr w:type="spellStart"/>
-      <w:proofErr w:type="gramStart"/>
-      <w:r>
-        <w:rPr>
-          <w:lang w:val="en-US"/>
-        </w:rPr>
-        <w:t>env:AndroidSigningKeyPassword</w:t>
-      </w:r>
-      <w:proofErr w:type="spellEnd"/>
-      <w:proofErr w:type="gramEnd"/>
-      <w:r>
-        <w:rPr>
-          <w:lang w:val="en-US"/>
-        </w:rPr>
-        <w:t xml:space="preserve"> = "</w:t>
-      </w:r>
-      <w:proofErr w:type="spellStart"/>
-      <w:r>
-        <w:rPr>
-          <w:lang w:val="en-US"/>
-        </w:rPr>
-        <w:t>your_password</w:t>
-      </w:r>
-      <w:proofErr w:type="spellEnd"/>
-      <w:r>
-        <w:rPr>
-          <w:lang w:val="en-US"/>
-        </w:rPr>
-        <w:t>"</w:t>
-      </w:r>
-    </w:p>
-    <w:p>
-      <w:pPr>
-        <w:autoSpaceDE w:val="0"/>
-        <w:autoSpaceDN w:val="0"/>
-        <w:adjustRightInd w:val="0"/>
-        <w:spacing w:after="0" w:line="240" w:lineRule="auto"/>
-        <w:rPr>
-          <w:rFonts w:ascii="Segoe UI" w:eastAsia="Times New Roman" w:hAnsi="Segoe UI" w:cs="Segoe UI"/>
-          <w:b/>
-          <w:bCs/>
-          <w:color w:val="1E1E1E"/>
-          <w:lang w:val="en-US"/>
-        </w:rPr>
-      </w:pPr>
-    </w:p>
-    <w:p>
-      <w:pPr>
-        <w:autoSpaceDE w:val="0"/>
-        <w:autoSpaceDN w:val="0"/>
-        <w:adjustRightInd w:val="0"/>
-        <w:spacing w:after="0" w:line="240" w:lineRule="auto"/>
-        <w:rPr>
-          <w:rFonts w:ascii="Segoe UI" w:eastAsia="Times New Roman" w:hAnsi="Segoe UI" w:cs="Segoe UI"/>
-          <w:color w:val="1E1E1E"/>
-          <w:lang w:val="en-US"/>
-        </w:rPr>
-      </w:pPr>
-      <w:r>
-        <w:rPr>
-          <w:rFonts w:ascii="Segoe UI" w:eastAsia="Times New Roman" w:hAnsi="Segoe UI" w:cs="Segoe UI"/>
-          <w:b/>
-          <w:bCs/>
-          <w:color w:val="1E1E1E"/>
+        <w:pStyle w:val="Heading2"/>
+        <w:rPr>
+          <w:rFonts w:eastAsia="Times New Roman"/>
+          <w:lang w:val="en-US"/>
+        </w:rPr>
+      </w:pPr>
+      <w:bookmarkStart w:id="3" w:name="_Toc224840314"/>
+      <w:r>
+        <w:rPr>
+          <w:rFonts w:eastAsia="Times New Roman"/>
           <w:lang w:val="en-US"/>
         </w:rPr>
         <w:t>3. Create Store Assets</w:t>
       </w:r>
+      <w:bookmarkEnd w:id="3"/>
     </w:p>
     <w:p>
       <w:pPr>
@@ -1026,27 +2008,21 @@
     </w:p>
     <w:p>
       <w:pPr>
-        <w:autoSpaceDE w:val="0"/>
-        <w:autoSpaceDN w:val="0"/>
-        <w:adjustRightInd w:val="0"/>
-        <w:spacing w:after="0" w:line="240" w:lineRule="auto"/>
-        <w:rPr>
-          <w:rFonts w:ascii="Segoe UI" w:eastAsia="Times New Roman" w:hAnsi="Segoe UI" w:cs="Times New Roman"/>
-          <w:color w:val="1E1E1E"/>
-          <w:szCs w:val="18"/>
-          <w:lang w:val="en-US"/>
-        </w:rPr>
-      </w:pPr>
-      <w:r>
-        <w:rPr>
-          <w:rFonts w:ascii="Segoe UI" w:eastAsia="Times New Roman" w:hAnsi="Segoe UI" w:cs="Times New Roman"/>
-          <w:b/>
-          <w:color w:val="1E1E1E"/>
-          <w:szCs w:val="18"/>
+        <w:pStyle w:val="Heading2"/>
+        <w:rPr>
+          <w:rFonts w:eastAsia="Times New Roman"/>
+          <w:lang w:val="en-US"/>
+        </w:rPr>
+      </w:pPr>
+      <w:bookmarkStart w:id="4" w:name="_Toc224840315"/>
+      <w:r>
+        <w:rPr>
+          <w:rFonts w:eastAsia="Times New Roman"/>
           <w:lang w:val="en-US"/>
         </w:rPr>
         <w:t>4. Host Privacy Policy</w:t>
       </w:r>
+      <w:bookmarkEnd w:id="4"/>
     </w:p>
     <w:p>
       <w:pPr>
@@ -1343,6 +2319,198 @@
     </w:p>
     <w:p>
       <w:pPr>
+        <w:pStyle w:val="Heading2"/>
+        <w:rPr>
+          <w:lang w:val="en-US"/>
+        </w:rPr>
+      </w:pPr>
+      <w:bookmarkStart w:id="5" w:name="_Toc224840316"/>
+      <w:r>
+        <w:rPr>
+          <w:lang w:val="en-US"/>
+        </w:rPr>
+        <w:t>5. Build Release AAB</w:t>
+      </w:r>
+      <w:bookmarkEnd w:id="5"/>
+    </w:p>
+    <w:p>
+      <w:pPr>
+        <w:pStyle w:val="NoSpacing"/>
+        <w:rPr>
+          <w:lang w:val="en-US"/>
+        </w:rPr>
+      </w:pPr>
+      <w:r>
+        <w:rPr>
+          <w:lang w:val="en-US"/>
+        </w:rPr>
+        <w:t># Set passwords (if using env vars)</w:t>
+      </w:r>
+    </w:p>
+    <w:p>
+      <w:pPr>
+        <w:pStyle w:val="NoSpacing"/>
+        <w:rPr>
+          <w:lang w:val="en-US"/>
+        </w:rPr>
+      </w:pPr>
+      <w:r>
+        <w:rPr>
+          <w:lang w:val="en-US"/>
+        </w:rPr>
+        <w:t>$</w:t>
+      </w:r>
+      <w:proofErr w:type="spellStart"/>
+      <w:proofErr w:type="gramStart"/>
+      <w:r>
+        <w:rPr>
+          <w:lang w:val="en-US"/>
+        </w:rPr>
+        <w:t>env:AndroidSigningStorePassword</w:t>
+      </w:r>
+      <w:proofErr w:type="spellEnd"/>
+      <w:proofErr w:type="gramEnd"/>
+      <w:r>
+        <w:rPr>
+          <w:lang w:val="en-US"/>
+        </w:rPr>
+        <w:t xml:space="preserve"> = "</w:t>
+      </w:r>
+      <w:proofErr w:type="spellStart"/>
+      <w:r>
+        <w:rPr>
+          <w:lang w:val="en-US"/>
+        </w:rPr>
+        <w:t>your_password</w:t>
+      </w:r>
+      <w:proofErr w:type="spellEnd"/>
+      <w:r>
+        <w:rPr>
+          <w:lang w:val="en-US"/>
+        </w:rPr>
+        <w:t>"</w:t>
+      </w:r>
+    </w:p>
+    <w:p>
+      <w:pPr>
+        <w:pStyle w:val="NoSpacing"/>
+        <w:rPr>
+          <w:lang w:val="en-US"/>
+        </w:rPr>
+      </w:pPr>
+      <w:r>
+        <w:rPr>
+          <w:lang w:val="en-US"/>
+        </w:rPr>
+        <w:t>$</w:t>
+      </w:r>
+      <w:proofErr w:type="spellStart"/>
+      <w:proofErr w:type="gramStart"/>
+      <w:r>
+        <w:rPr>
+          <w:lang w:val="en-US"/>
+        </w:rPr>
+        <w:t>env:AndroidSigningKeyPassword</w:t>
+      </w:r>
+      <w:proofErr w:type="spellEnd"/>
+      <w:proofErr w:type="gramEnd"/>
+      <w:r>
+        <w:rPr>
+          <w:lang w:val="en-US"/>
+        </w:rPr>
+        <w:t xml:space="preserve"> = "</w:t>
+      </w:r>
+      <w:proofErr w:type="spellStart"/>
+      <w:r>
+        <w:rPr>
+          <w:lang w:val="en-US"/>
+        </w:rPr>
+        <w:t>your_password</w:t>
+      </w:r>
+      <w:proofErr w:type="spellEnd"/>
+      <w:r>
+        <w:rPr>
+          <w:lang w:val="en-US"/>
+        </w:rPr>
+        <w:t>"</w:t>
+      </w:r>
+    </w:p>
+    <w:p>
+      <w:pPr>
+        <w:pStyle w:val="NoSpacing"/>
+        <w:rPr>
+          <w:lang w:val="en-US"/>
+        </w:rPr>
+      </w:pPr>
+    </w:p>
+    <w:p>
+      <w:pPr>
+        <w:pStyle w:val="NoSpacing"/>
+        <w:rPr>
+          <w:lang w:val="en-US"/>
+        </w:rPr>
+      </w:pPr>
+      <w:r>
+        <w:rPr>
+          <w:lang w:val="en-US"/>
+        </w:rPr>
+        <w:t># Build</w:t>
+      </w:r>
+    </w:p>
+    <w:p>
+      <w:pPr>
+        <w:pStyle w:val="NoSpacing"/>
+        <w:rPr>
+          <w:lang w:val="en-US"/>
+        </w:rPr>
+      </w:pPr>
+      <w:r>
+        <w:rPr>
+          <w:lang w:val="en-US"/>
+        </w:rPr>
+        <w:t>dotnet clean -c Release</w:t>
+      </w:r>
+    </w:p>
+    <w:p>
+      <w:pPr>
+        <w:pStyle w:val="NoSpacing"/>
+        <w:rPr>
+          <w:lang w:val="en-US"/>
+        </w:rPr>
+      </w:pPr>
+      <w:r>
+        <w:rPr>
+          <w:lang w:val="en-US"/>
+        </w:rPr>
+        <w:t>dotnet publish -f net10.0-android -c Release /</w:t>
+      </w:r>
+      <w:proofErr w:type="spellStart"/>
+      <w:proofErr w:type="gramStart"/>
+      <w:r>
+        <w:rPr>
+          <w:lang w:val="en-US"/>
+        </w:rPr>
+        <w:t>p:AndroidPackageFormat</w:t>
+      </w:r>
+      <w:proofErr w:type="spellEnd"/>
+      <w:proofErr w:type="gramEnd"/>
+      <w:r>
+        <w:rPr>
+          <w:lang w:val="en-US"/>
+        </w:rPr>
+        <w:t>=</w:t>
+      </w:r>
+      <w:proofErr w:type="spellStart"/>
+      <w:r>
+        <w:rPr>
+          <w:lang w:val="en-US"/>
+        </w:rPr>
+        <w:t>aab</w:t>
+      </w:r>
+      <w:proofErr w:type="spellEnd"/>
+    </w:p>
+    <w:p>
+      <w:pPr>
         <w:rPr>
           <w:rFonts w:ascii="Segoe UI" w:hAnsi="Segoe UI" w:cs="Segoe UI"/>
           <w:b/>
@@ -1351,296 +2519,99 @@
           <w:lang w:val="en-US"/>
         </w:rPr>
       </w:pPr>
-      <w:r>
-        <w:rPr>
-          <w:rFonts w:ascii="Segoe UI" w:hAnsi="Segoe UI" w:cs="Segoe UI"/>
-          <w:b/>
-          <w:bCs/>
-          <w:color w:val="1E1E1E"/>
-          <w:lang w:val="en-US"/>
-        </w:rPr>
-        <w:lastRenderedPageBreak/>
-        <w:t>5. Build Release AAB</w:t>
-      </w:r>
+    </w:p>
+    <w:p>
+      <w:pPr>
+        <w:pStyle w:val="Heading2"/>
+      </w:pPr>
+      <w:bookmarkStart w:id="6" w:name="_Toc224840317"/>
+      <w:r>
+        <w:rPr>
+          <w:lang w:val="en-US"/>
+        </w:rPr>
+        <w:t>6. Test Release Build</w:t>
+      </w:r>
+      <w:bookmarkEnd w:id="6"/>
     </w:p>
     <w:p>
       <w:pPr>
         <w:pStyle w:val="NoSpacing"/>
-        <w:rPr>
-          <w:lang w:val="en-US"/>
-        </w:rPr>
-      </w:pPr>
-      <w:r>
-        <w:rPr>
-          <w:lang w:val="en-US"/>
-        </w:rPr>
-        <w:t># Set passwords (if using env vars)</w:t>
+      </w:pPr>
+      <w:r>
+        <w:t># Install and test</w:t>
       </w:r>
     </w:p>
     <w:p>
       <w:pPr>
         <w:pStyle w:val="NoSpacing"/>
-        <w:rPr>
-          <w:lang w:val="en-US"/>
-        </w:rPr>
-      </w:pPr>
-      <w:r>
-        <w:rPr>
-          <w:lang w:val="en-US"/>
-        </w:rPr>
-        <w:t>$</w:t>
+      </w:pPr>
+      <w:proofErr w:type="spellStart"/>
+      <w:r>
+        <w:t>bundletool</w:t>
+      </w:r>
+      <w:proofErr w:type="spellEnd"/>
+      <w:r>
+        <w:t xml:space="preserve"> build-</w:t>
+      </w:r>
+      <w:proofErr w:type="spellStart"/>
+      <w:r>
+        <w:t>apks</w:t>
+      </w:r>
+      <w:proofErr w:type="spellEnd"/>
+      <w:r>
+        <w:t xml:space="preserve"> --bundle=</w:t>
+      </w:r>
+      <w:proofErr w:type="spellStart"/>
+      <w:r>
+        <w:t>com.andrewestherhuysen.turftime-Signed.aab</w:t>
+      </w:r>
+      <w:proofErr w:type="spellEnd"/>
+      <w:r>
+        <w:t xml:space="preserve"> --output=</w:t>
       </w:r>
       <w:proofErr w:type="spellStart"/>
       <w:proofErr w:type="gramStart"/>
       <w:r>
-        <w:rPr>
-          <w:lang w:val="en-US"/>
-        </w:rPr>
-        <w:t>env:AndroidSigningStorePassword</w:t>
+        <w:t>turftime.apks</w:t>
       </w:r>
       <w:proofErr w:type="spellEnd"/>
       <w:proofErr w:type="gramEnd"/>
-      <w:r>
-        <w:rPr>
-          <w:lang w:val="en-US"/>
-        </w:rPr>
-        <w:t xml:space="preserve"> = "</w:t>
-      </w:r>
+    </w:p>
+    <w:p>
+      <w:pPr>
+        <w:pStyle w:val="NoSpacing"/>
+      </w:pPr>
       <w:proofErr w:type="spellStart"/>
       <w:r>
-        <w:rPr>
-          <w:lang w:val="en-US"/>
-        </w:rPr>
-        <w:t>your_password</w:t>
+        <w:t>bundletool</w:t>
       </w:r>
       <w:proofErr w:type="spellEnd"/>
       <w:r>
-        <w:rPr>
-          <w:lang w:val="en-US"/>
-        </w:rPr>
-        <w:t>"</w:t>
-      </w:r>
-    </w:p>
-    <w:p>
-      <w:pPr>
-        <w:pStyle w:val="NoSpacing"/>
-        <w:rPr>
-          <w:lang w:val="en-US"/>
-        </w:rPr>
-      </w:pPr>
-      <w:r>
-        <w:rPr>
-          <w:lang w:val="en-US"/>
-        </w:rPr>
-        <w:t>$</w:t>
+        <w:t xml:space="preserve"> install-</w:t>
+      </w:r>
+      <w:proofErr w:type="spellStart"/>
+      <w:r>
+        <w:t>apks</w:t>
+      </w:r>
+      <w:proofErr w:type="spellEnd"/>
+      <w:r>
+        <w:t xml:space="preserve"> --</w:t>
+      </w:r>
+      <w:proofErr w:type="spellStart"/>
+      <w:r>
+        <w:t>apks</w:t>
+      </w:r>
+      <w:proofErr w:type="spellEnd"/>
+      <w:r>
+        <w:t>=</w:t>
       </w:r>
       <w:proofErr w:type="spellStart"/>
       <w:proofErr w:type="gramStart"/>
       <w:r>
-        <w:rPr>
-          <w:lang w:val="en-US"/>
-        </w:rPr>
-        <w:t>env:AndroidSigningKeyPassword</w:t>
+        <w:t>turftime.apks</w:t>
       </w:r>
       <w:proofErr w:type="spellEnd"/>
       <w:proofErr w:type="gramEnd"/>
-      <w:r>
-        <w:rPr>
-          <w:lang w:val="en-US"/>
-        </w:rPr>
-        <w:t xml:space="preserve"> = "</w:t>
-      </w:r>
-      <w:proofErr w:type="spellStart"/>
-      <w:r>
-        <w:rPr>
-          <w:lang w:val="en-US"/>
-        </w:rPr>
-        <w:t>your_password</w:t>
-      </w:r>
-      <w:proofErr w:type="spellEnd"/>
-      <w:r>
-        <w:rPr>
-          <w:lang w:val="en-US"/>
-        </w:rPr>
-        <w:t>"</w:t>
-      </w:r>
-    </w:p>
-    <w:p>
-      <w:pPr>
-        <w:pStyle w:val="NoSpacing"/>
-        <w:rPr>
-          <w:lang w:val="en-US"/>
-        </w:rPr>
-      </w:pPr>
-    </w:p>
-    <w:p>
-      <w:pPr>
-        <w:pStyle w:val="NoSpacing"/>
-        <w:rPr>
-          <w:lang w:val="en-US"/>
-        </w:rPr>
-      </w:pPr>
-      <w:r>
-        <w:rPr>
-          <w:lang w:val="en-US"/>
-        </w:rPr>
-        <w:t># Build</w:t>
-      </w:r>
-    </w:p>
-    <w:p>
-      <w:pPr>
-        <w:pStyle w:val="NoSpacing"/>
-        <w:rPr>
-          <w:lang w:val="en-US"/>
-        </w:rPr>
-      </w:pPr>
-      <w:r>
-        <w:rPr>
-          <w:lang w:val="en-US"/>
-        </w:rPr>
-        <w:t>dotnet clean -c Release</w:t>
-      </w:r>
-    </w:p>
-    <w:p>
-      <w:pPr>
-        <w:pStyle w:val="NoSpacing"/>
-        <w:rPr>
-          <w:lang w:val="en-US"/>
-        </w:rPr>
-      </w:pPr>
-      <w:r>
-        <w:rPr>
-          <w:lang w:val="en-US"/>
-        </w:rPr>
-        <w:t>dotnet publish -f net10.0-android -c Release /</w:t>
-      </w:r>
-      <w:proofErr w:type="spellStart"/>
-      <w:proofErr w:type="gramStart"/>
-      <w:r>
-        <w:rPr>
-          <w:lang w:val="en-US"/>
-        </w:rPr>
-        <w:t>p:AndroidPackageFormat</w:t>
-      </w:r>
-      <w:proofErr w:type="spellEnd"/>
-      <w:proofErr w:type="gramEnd"/>
-      <w:r>
-        <w:rPr>
-          <w:lang w:val="en-US"/>
-        </w:rPr>
-        <w:t>=</w:t>
-      </w:r>
-      <w:proofErr w:type="spellStart"/>
-      <w:r>
-        <w:rPr>
-          <w:lang w:val="en-US"/>
-        </w:rPr>
-        <w:t>aab</w:t>
-      </w:r>
-      <w:proofErr w:type="spellEnd"/>
-    </w:p>
-    <w:p>
-      <w:pPr>
-        <w:rPr>
-          <w:rFonts w:ascii="Segoe UI" w:hAnsi="Segoe UI" w:cs="Segoe UI"/>
-          <w:b/>
-          <w:bCs/>
-          <w:color w:val="1E1E1E"/>
-          <w:lang w:val="en-US"/>
-        </w:rPr>
-      </w:pPr>
-    </w:p>
-    <w:p>
-      <w:r>
-        <w:rPr>
-          <w:rFonts w:ascii="Segoe UI" w:hAnsi="Segoe UI" w:cs="Segoe UI"/>
-          <w:b/>
-          <w:bCs/>
-          <w:color w:val="1E1E1E"/>
-          <w:lang w:val="en-US"/>
-        </w:rPr>
-        <w:t>6. Test Release Build</w:t>
-      </w:r>
-    </w:p>
-    <w:p>
-      <w:pPr>
-        <w:pStyle w:val="NoSpacing"/>
-      </w:pPr>
-      <w:r>
-        <w:t># Install and test</w:t>
-      </w:r>
-    </w:p>
-    <w:p>
-      <w:pPr>
-        <w:pStyle w:val="NoSpacing"/>
-      </w:pPr>
-      <w:proofErr w:type="spellStart"/>
-      <w:r>
-        <w:t>bundletool</w:t>
-      </w:r>
-      <w:proofErr w:type="spellEnd"/>
-      <w:r>
-        <w:t xml:space="preserve"> build-</w:t>
-      </w:r>
-      <w:proofErr w:type="spellStart"/>
-      <w:r>
-        <w:t>apks</w:t>
-      </w:r>
-      <w:proofErr w:type="spellEnd"/>
-      <w:r>
-        <w:t xml:space="preserve"> --bundle=</w:t>
-      </w:r>
-      <w:proofErr w:type="spellStart"/>
-      <w:r>
-        <w:t>com.andrewestherhuysen.turftime-Signed.aab</w:t>
-      </w:r>
-      <w:proofErr w:type="spellEnd"/>
-      <w:r>
-        <w:t xml:space="preserve"> --output=</w:t>
-      </w:r>
-      <w:proofErr w:type="spellStart"/>
-      <w:proofErr w:type="gramStart"/>
-      <w:r>
-        <w:t>turftime.apks</w:t>
-      </w:r>
-      <w:proofErr w:type="spellEnd"/>
-      <w:proofErr w:type="gramEnd"/>
-    </w:p>
-    <w:p>
-      <w:pPr>
-        <w:pStyle w:val="NoSpacing"/>
-      </w:pPr>
-      <w:proofErr w:type="spellStart"/>
-      <w:r>
-        <w:t>bundletool</w:t>
-      </w:r>
-      <w:proofErr w:type="spellEnd"/>
-      <w:r>
-        <w:t xml:space="preserve"> install-</w:t>
-      </w:r>
-      <w:proofErr w:type="spellStart"/>
-      <w:r>
-        <w:t>apks</w:t>
-      </w:r>
-      <w:proofErr w:type="spellEnd"/>
-      <w:r>
-        <w:t xml:space="preserve"> --</w:t>
-      </w:r>
-      <w:proofErr w:type="spellStart"/>
-      <w:r>
-        <w:t>apks</w:t>
-      </w:r>
-      <w:proofErr w:type="spellEnd"/>
-      <w:r>
-        <w:t>=</w:t>
-      </w:r>
-      <w:proofErr w:type="spellStart"/>
-      <w:proofErr w:type="gramStart"/>
-      <w:r>
-        <w:t>turftime.apks</w:t>
-      </w:r>
-      <w:proofErr w:type="spellEnd"/>
-      <w:proofErr w:type="gramEnd"/>
     </w:p>
     <w:p/>
     <w:p>
@@ -1670,27 +2641,21 @@
     </w:p>
     <w:p>
       <w:pPr>
-        <w:autoSpaceDE w:val="0"/>
-        <w:autoSpaceDN w:val="0"/>
-        <w:adjustRightInd w:val="0"/>
-        <w:spacing w:after="0" w:line="240" w:lineRule="auto"/>
-        <w:rPr>
-          <w:rFonts w:ascii="Segoe UI" w:eastAsia="Times New Roman" w:hAnsi="Segoe UI" w:cs="Times New Roman"/>
-          <w:color w:val="1E1E1E"/>
-          <w:szCs w:val="18"/>
-          <w:lang w:val="en-US"/>
-        </w:rPr>
-      </w:pPr>
-      <w:r>
-        <w:rPr>
-          <w:rFonts w:ascii="Segoe UI" w:eastAsia="Times New Roman" w:hAnsi="Segoe UI" w:cs="Times New Roman"/>
-          <w:b/>
-          <w:color w:val="1E1E1E"/>
-          <w:szCs w:val="18"/>
+        <w:pStyle w:val="Heading2"/>
+        <w:rPr>
+          <w:rFonts w:eastAsia="Times New Roman"/>
+          <w:lang w:val="en-US"/>
+        </w:rPr>
+      </w:pPr>
+      <w:bookmarkStart w:id="7" w:name="_Toc224840318"/>
+      <w:r>
+        <w:rPr>
+          <w:rFonts w:eastAsia="Times New Roman"/>
           <w:lang w:val="en-US"/>
         </w:rPr>
         <w:t>7. Create Google Play Console Account</w:t>
       </w:r>
+      <w:bookmarkEnd w:id="7"/>
     </w:p>
     <w:p>
       <w:pPr>
@@ -1761,6 +2726,7 @@
           <w:szCs w:val="18"/>
           <w:lang w:val="en-US"/>
         </w:rPr>
+        <w:lastRenderedPageBreak/>
         <w:t xml:space="preserve">Pay $25 one-time registration </w:t>
       </w:r>
       <w:proofErr w:type="gramStart"/>
@@ -1808,27 +2774,21 @@
     </w:p>
     <w:p>
       <w:pPr>
-        <w:autoSpaceDE w:val="0"/>
-        <w:autoSpaceDN w:val="0"/>
-        <w:adjustRightInd w:val="0"/>
-        <w:spacing w:after="0" w:line="240" w:lineRule="auto"/>
-        <w:rPr>
-          <w:rFonts w:ascii="Segoe UI" w:eastAsia="Times New Roman" w:hAnsi="Segoe UI" w:cs="Times New Roman"/>
-          <w:color w:val="1E1E1E"/>
-          <w:szCs w:val="18"/>
-          <w:lang w:val="en-US"/>
-        </w:rPr>
-      </w:pPr>
-      <w:r>
-        <w:rPr>
-          <w:rFonts w:ascii="Segoe UI" w:eastAsia="Times New Roman" w:hAnsi="Segoe UI" w:cs="Times New Roman"/>
-          <w:b/>
-          <w:color w:val="1E1E1E"/>
-          <w:szCs w:val="18"/>
+        <w:pStyle w:val="Heading2"/>
+        <w:rPr>
+          <w:rFonts w:eastAsia="Times New Roman"/>
+          <w:lang w:val="en-US"/>
+        </w:rPr>
+      </w:pPr>
+      <w:bookmarkStart w:id="8" w:name="_Toc224840319"/>
+      <w:r>
+        <w:rPr>
+          <w:rFonts w:eastAsia="Times New Roman"/>
           <w:lang w:val="en-US"/>
         </w:rPr>
         <w:t>8. Upload to Play Console</w:t>
       </w:r>
+      <w:bookmarkEnd w:id="8"/>
     </w:p>
     <w:p>
       <w:pPr>
@@ -1895,49 +2855,28 @@
     </w:p>
     <w:p>
       <w:pPr>
-        <w:autoSpaceDE w:val="0"/>
-        <w:autoSpaceDN w:val="0"/>
-        <w:adjustRightInd w:val="0"/>
-        <w:spacing w:after="0" w:line="240" w:lineRule="auto"/>
-        <w:rPr>
-          <w:rFonts w:ascii="Segoe UI" w:eastAsia="Times New Roman" w:hAnsi="Segoe UI" w:cs="Times New Roman"/>
-          <w:color w:val="1E1E1E"/>
-          <w:sz w:val="24"/>
-          <w:szCs w:val="18"/>
-          <w:lang w:val="en-US"/>
-        </w:rPr>
-      </w:pPr>
+        <w:pStyle w:val="Heading1"/>
+        <w:rPr>
+          <w:rFonts w:eastAsia="Times New Roman"/>
+          <w:lang w:val="en-US"/>
+        </w:rPr>
+      </w:pPr>
+      <w:bookmarkStart w:id="9" w:name="_Toc224840320"/>
       <w:r>
         <w:rPr>
           <w:rFonts w:ascii="Segoe UI Emoji" w:eastAsia="Times New Roman" w:hAnsi="Segoe UI Emoji" w:cs="Segoe UI Emoji"/>
-          <w:color w:val="1E1E1E"/>
-          <w:sz w:val="24"/>
-          <w:szCs w:val="18"/>
           <w:lang w:val="en-US"/>
         </w:rPr>
         <w:t>⚠️</w:t>
       </w:r>
       <w:r>
         <w:rPr>
-          <w:rFonts w:ascii="Segoe UI" w:eastAsia="Times New Roman" w:hAnsi="Segoe UI" w:cs="Times New Roman"/>
-          <w:color w:val="1E1E1E"/>
-          <w:sz w:val="24"/>
-          <w:szCs w:val="18"/>
-          <w:lang w:val="en-US"/>
-        </w:rPr>
-        <w:t xml:space="preserve"> </w:t>
-      </w:r>
-      <w:r>
-        <w:rPr>
-          <w:rFonts w:ascii="Segoe UI" w:eastAsia="Times New Roman" w:hAnsi="Segoe UI" w:cs="Times New Roman"/>
-          <w:b/>
-          <w:color w:val="1E1E1E"/>
-          <w:sz w:val="24"/>
-          <w:szCs w:val="18"/>
-          <w:lang w:val="en-US"/>
-        </w:rPr>
-        <w:t>CRITICAL REMINDERS</w:t>
-      </w:r>
+          <w:rFonts w:eastAsia="Times New Roman"/>
+          <w:lang w:val="en-US"/>
+        </w:rPr>
+        <w:t xml:space="preserve"> CRITICAL REMINDERS</w:t>
+      </w:r>
+      <w:bookmarkEnd w:id="9"/>
     </w:p>
     <w:p>
       <w:pPr>
@@ -2260,49 +3199,28 @@
     </w:p>
     <w:p>
       <w:pPr>
-        <w:autoSpaceDE w:val="0"/>
-        <w:autoSpaceDN w:val="0"/>
-        <w:adjustRightInd w:val="0"/>
-        <w:spacing w:after="0" w:line="240" w:lineRule="auto"/>
-        <w:rPr>
-          <w:rFonts w:ascii="Segoe UI" w:eastAsia="Times New Roman" w:hAnsi="Segoe UI" w:cs="Times New Roman"/>
-          <w:color w:val="1E1E1E"/>
-          <w:sz w:val="24"/>
-          <w:szCs w:val="18"/>
-          <w:lang w:val="en-US"/>
-        </w:rPr>
-      </w:pPr>
+        <w:pStyle w:val="Heading1"/>
+        <w:rPr>
+          <w:rFonts w:eastAsia="Times New Roman"/>
+          <w:lang w:val="en-US"/>
+        </w:rPr>
+      </w:pPr>
+      <w:bookmarkStart w:id="10" w:name="_Toc224840321"/>
       <w:r>
         <w:rPr>
           <w:rFonts w:ascii="Segoe UI Emoji" w:eastAsia="Times New Roman" w:hAnsi="Segoe UI Emoji" w:cs="Segoe UI Emoji"/>
-          <w:color w:val="1E1E1E"/>
-          <w:sz w:val="24"/>
-          <w:szCs w:val="18"/>
           <w:lang w:val="en-US"/>
         </w:rPr>
         <w:t>🆘</w:t>
       </w:r>
       <w:r>
         <w:rPr>
-          <w:rFonts w:ascii="Segoe UI" w:eastAsia="Times New Roman" w:hAnsi="Segoe UI" w:cs="Times New Roman"/>
-          <w:color w:val="1E1E1E"/>
-          <w:sz w:val="24"/>
-          <w:szCs w:val="18"/>
-          <w:lang w:val="en-US"/>
-        </w:rPr>
-        <w:t xml:space="preserve"> </w:t>
-      </w:r>
-      <w:r>
-        <w:rPr>
-          <w:rFonts w:ascii="Segoe UI" w:eastAsia="Times New Roman" w:hAnsi="Segoe UI" w:cs="Times New Roman"/>
-          <w:b/>
-          <w:color w:val="1E1E1E"/>
-          <w:sz w:val="24"/>
-          <w:szCs w:val="18"/>
-          <w:lang w:val="en-US"/>
-        </w:rPr>
-        <w:t>If You Get Stuck</w:t>
-      </w:r>
+          <w:rFonts w:eastAsia="Times New Roman"/>
+          <w:lang w:val="en-US"/>
+        </w:rPr>
+        <w:t xml:space="preserve"> If You Get Stuck</w:t>
+      </w:r>
+      <w:bookmarkEnd w:id="10"/>
     </w:p>
     <w:p>
       <w:pPr>
@@ -2529,49 +3447,28 @@
     </w:p>
     <w:p>
       <w:pPr>
-        <w:autoSpaceDE w:val="0"/>
-        <w:autoSpaceDN w:val="0"/>
-        <w:adjustRightInd w:val="0"/>
-        <w:spacing w:after="0" w:line="240" w:lineRule="auto"/>
-        <w:rPr>
-          <w:rFonts w:ascii="Segoe UI" w:eastAsia="Times New Roman" w:hAnsi="Segoe UI" w:cs="Times New Roman"/>
-          <w:color w:val="1E1E1E"/>
-          <w:sz w:val="24"/>
-          <w:szCs w:val="18"/>
-          <w:lang w:val="en-US"/>
-        </w:rPr>
-      </w:pPr>
+        <w:pStyle w:val="Heading1"/>
+        <w:rPr>
+          <w:rFonts w:eastAsia="Times New Roman"/>
+          <w:lang w:val="en-US"/>
+        </w:rPr>
+      </w:pPr>
+      <w:bookmarkStart w:id="11" w:name="_Toc224840322"/>
       <w:r>
         <w:rPr>
           <w:rFonts w:ascii="Segoe UI Emoji" w:eastAsia="Times New Roman" w:hAnsi="Segoe UI Emoji" w:cs="Segoe UI Emoji"/>
-          <w:color w:val="1E1E1E"/>
-          <w:sz w:val="24"/>
-          <w:szCs w:val="18"/>
           <w:lang w:val="en-US"/>
         </w:rPr>
         <w:t>📊</w:t>
       </w:r>
       <w:r>
         <w:rPr>
-          <w:rFonts w:ascii="Segoe UI" w:eastAsia="Times New Roman" w:hAnsi="Segoe UI" w:cs="Times New Roman"/>
-          <w:color w:val="1E1E1E"/>
-          <w:sz w:val="24"/>
-          <w:szCs w:val="18"/>
-          <w:lang w:val="en-US"/>
-        </w:rPr>
-        <w:t xml:space="preserve"> </w:t>
-      </w:r>
-      <w:r>
-        <w:rPr>
-          <w:rFonts w:ascii="Segoe UI" w:eastAsia="Times New Roman" w:hAnsi="Segoe UI" w:cs="Times New Roman"/>
-          <w:b/>
-          <w:color w:val="1E1E1E"/>
-          <w:sz w:val="24"/>
-          <w:szCs w:val="18"/>
-          <w:lang w:val="en-US"/>
-        </w:rPr>
-        <w:t>Estimated Timeline</w:t>
-      </w:r>
+          <w:rFonts w:eastAsia="Times New Roman"/>
+          <w:lang w:val="en-US"/>
+        </w:rPr>
+        <w:t xml:space="preserve"> Estimated Timeline</w:t>
+      </w:r>
+      <w:bookmarkEnd w:id="11"/>
     </w:p>
     <w:p>
       <w:pPr>
@@ -2600,7 +3497,6 @@
           <w:szCs w:val="18"/>
           <w:lang w:val="en-US"/>
         </w:rPr>
-        <w:lastRenderedPageBreak/>
         <w:t xml:space="preserve">Keystore generation: </w:t>
       </w:r>
       <w:r>
@@ -2850,49 +3746,28 @@
     </w:p>
     <w:p>
       <w:pPr>
-        <w:autoSpaceDE w:val="0"/>
-        <w:autoSpaceDN w:val="0"/>
-        <w:adjustRightInd w:val="0"/>
-        <w:spacing w:after="0" w:line="240" w:lineRule="auto"/>
-        <w:rPr>
-          <w:rFonts w:ascii="Segoe UI" w:eastAsia="Times New Roman" w:hAnsi="Segoe UI" w:cs="Times New Roman"/>
-          <w:color w:val="1E1E1E"/>
-          <w:sz w:val="24"/>
-          <w:szCs w:val="18"/>
-          <w:lang w:val="en-US"/>
-        </w:rPr>
-      </w:pPr>
+        <w:pStyle w:val="Heading1"/>
+        <w:rPr>
+          <w:rFonts w:eastAsia="Times New Roman"/>
+          <w:lang w:val="en-US"/>
+        </w:rPr>
+      </w:pPr>
+      <w:bookmarkStart w:id="12" w:name="_Toc224840323"/>
       <w:r>
         <w:rPr>
           <w:rFonts w:ascii="Segoe UI Emoji" w:eastAsia="Times New Roman" w:hAnsi="Segoe UI Emoji" w:cs="Segoe UI Emoji"/>
-          <w:color w:val="1E1E1E"/>
-          <w:sz w:val="24"/>
-          <w:szCs w:val="18"/>
           <w:lang w:val="en-US"/>
         </w:rPr>
         <w:t>🎉</w:t>
       </w:r>
       <w:r>
         <w:rPr>
-          <w:rFonts w:ascii="Segoe UI" w:eastAsia="Times New Roman" w:hAnsi="Segoe UI" w:cs="Times New Roman"/>
-          <w:color w:val="1E1E1E"/>
-          <w:sz w:val="24"/>
-          <w:szCs w:val="18"/>
-          <w:lang w:val="en-US"/>
-        </w:rPr>
-        <w:t xml:space="preserve"> </w:t>
-      </w:r>
-      <w:r>
-        <w:rPr>
-          <w:rFonts w:ascii="Segoe UI" w:eastAsia="Times New Roman" w:hAnsi="Segoe UI" w:cs="Times New Roman"/>
-          <w:b/>
-          <w:color w:val="1E1E1E"/>
-          <w:sz w:val="24"/>
-          <w:szCs w:val="18"/>
-          <w:lang w:val="en-US"/>
-        </w:rPr>
-        <w:t>You're Ready!</w:t>
-      </w:r>
+          <w:rFonts w:eastAsia="Times New Roman"/>
+          <w:lang w:val="en-US"/>
+        </w:rPr>
+        <w:t xml:space="preserve"> You're Ready!</w:t>
+      </w:r>
+      <w:bookmarkEnd w:id="12"/>
     </w:p>
     <w:p>
       <w:pPr>
@@ -3566,6 +4441,49 @@
     <w:name w:val="Normal"/>
     <w:qFormat/>
   </w:style>
+  <w:style w:type="paragraph" w:styleId="Heading1">
+    <w:name w:val="heading 1"/>
+    <w:basedOn w:val="Normal"/>
+    <w:next w:val="Normal"/>
+    <w:link w:val="Heading1Char"/>
+    <w:uiPriority w:val="9"/>
+    <w:qFormat/>
+    <w:rsid w:val="003672B6"/>
+    <w:pPr>
+      <w:keepNext/>
+      <w:keepLines/>
+      <w:spacing w:before="240" w:after="0"/>
+      <w:outlineLvl w:val="0"/>
+    </w:pPr>
+    <w:rPr>
+      <w:rFonts w:asciiTheme="majorHAnsi" w:eastAsiaTheme="majorEastAsia" w:hAnsiTheme="majorHAnsi" w:cstheme="majorBidi"/>
+      <w:color w:val="2F5496" w:themeColor="accent1" w:themeShade="BF"/>
+      <w:sz w:val="32"/>
+      <w:szCs w:val="32"/>
+    </w:rPr>
+  </w:style>
+  <w:style w:type="paragraph" w:styleId="Heading2">
+    <w:name w:val="heading 2"/>
+    <w:basedOn w:val="Normal"/>
+    <w:next w:val="Normal"/>
+    <w:link w:val="Heading2Char"/>
+    <w:uiPriority w:val="9"/>
+    <w:unhideWhenUsed/>
+    <w:qFormat/>
+    <w:rsid w:val="003672B6"/>
+    <w:pPr>
+      <w:keepNext/>
+      <w:keepLines/>
+      <w:spacing w:before="40" w:after="0"/>
+      <w:outlineLvl w:val="1"/>
+    </w:pPr>
+    <w:rPr>
+      <w:rFonts w:asciiTheme="majorHAnsi" w:eastAsiaTheme="majorEastAsia" w:hAnsiTheme="majorHAnsi" w:cstheme="majorBidi"/>
+      <w:color w:val="2F5496" w:themeColor="accent1" w:themeShade="BF"/>
+      <w:sz w:val="26"/>
+      <w:szCs w:val="26"/>
+    </w:rPr>
+  </w:style>
   <w:style w:type="character" w:default="1" w:styleId="DefaultParagraphFont">
     <w:name w:val="Default Paragraph Font"/>
     <w:uiPriority w:val="1"/>
@@ -3601,6 +4519,83 @@
     <w:pPr>
       <w:spacing w:after="0" w:line="240" w:lineRule="auto"/>
     </w:pPr>
+  </w:style>
+  <w:style w:type="character" w:customStyle="1" w:styleId="Heading1Char">
+    <w:name w:val="Heading 1 Char"/>
+    <w:basedOn w:val="DefaultParagraphFont"/>
+    <w:link w:val="Heading1"/>
+    <w:uiPriority w:val="9"/>
+    <w:rsid w:val="003672B6"/>
+    <w:rPr>
+      <w:rFonts w:asciiTheme="majorHAnsi" w:eastAsiaTheme="majorEastAsia" w:hAnsiTheme="majorHAnsi" w:cstheme="majorBidi"/>
+      <w:color w:val="2F5496" w:themeColor="accent1" w:themeShade="BF"/>
+      <w:sz w:val="32"/>
+      <w:szCs w:val="32"/>
+    </w:rPr>
+  </w:style>
+  <w:style w:type="paragraph" w:styleId="TOCHeading">
+    <w:name w:val="TOC Heading"/>
+    <w:basedOn w:val="Heading1"/>
+    <w:next w:val="Normal"/>
+    <w:uiPriority w:val="39"/>
+    <w:unhideWhenUsed/>
+    <w:qFormat/>
+    <w:rsid w:val="003672B6"/>
+    <w:pPr>
+      <w:outlineLvl w:val="9"/>
+    </w:pPr>
+    <w:rPr>
+      <w:lang w:val="en-US"/>
+    </w:rPr>
+  </w:style>
+  <w:style w:type="character" w:customStyle="1" w:styleId="Heading2Char">
+    <w:name w:val="Heading 2 Char"/>
+    <w:basedOn w:val="DefaultParagraphFont"/>
+    <w:link w:val="Heading2"/>
+    <w:uiPriority w:val="9"/>
+    <w:rsid w:val="003672B6"/>
+    <w:rPr>
+      <w:rFonts w:asciiTheme="majorHAnsi" w:eastAsiaTheme="majorEastAsia" w:hAnsiTheme="majorHAnsi" w:cstheme="majorBidi"/>
+      <w:color w:val="2F5496" w:themeColor="accent1" w:themeShade="BF"/>
+      <w:sz w:val="26"/>
+      <w:szCs w:val="26"/>
+    </w:rPr>
+  </w:style>
+  <w:style w:type="paragraph" w:styleId="TOC1">
+    <w:name w:val="toc 1"/>
+    <w:basedOn w:val="Normal"/>
+    <w:next w:val="Normal"/>
+    <w:autoRedefine/>
+    <w:uiPriority w:val="39"/>
+    <w:unhideWhenUsed/>
+    <w:rsid w:val="003672B6"/>
+    <w:pPr>
+      <w:spacing w:after="100"/>
+    </w:pPr>
+  </w:style>
+  <w:style w:type="paragraph" w:styleId="TOC2">
+    <w:name w:val="toc 2"/>
+    <w:basedOn w:val="Normal"/>
+    <w:next w:val="Normal"/>
+    <w:autoRedefine/>
+    <w:uiPriority w:val="39"/>
+    <w:unhideWhenUsed/>
+    <w:rsid w:val="003672B6"/>
+    <w:pPr>
+      <w:spacing w:after="100"/>
+      <w:ind w:left="220"/>
+    </w:pPr>
+  </w:style>
+  <w:style w:type="character" w:styleId="Hyperlink">
+    <w:name w:val="Hyperlink"/>
+    <w:basedOn w:val="DefaultParagraphFont"/>
+    <w:uiPriority w:val="99"/>
+    <w:unhideWhenUsed/>
+    <w:rsid w:val="003672B6"/>
+    <w:rPr>
+      <w:color w:val="0563C1" w:themeColor="hyperlink"/>
+      <w:u w:val="single"/>
+    </w:rPr>
   </w:style>
 </w:styles>
 </file>
@@ -3898,4 +4893,16 @@
     </a:ext>
   </a:extLst>
 </a:theme>
+</file>
+
+<file path=customXml/item1.xml><?xml version="1.0" encoding="utf-8"?>
+<b:Sources xmlns:b="http://schemas.openxmlformats.org/officeDocument/2006/bibliography" xmlns="http://schemas.openxmlformats.org/officeDocument/2006/bibliography" SelectedStyle="\APASixthEditionOfficeOnline.xsl" StyleName="APA" Version="6"/>
+</file>
+
+<file path=customXml/itemProps1.xml><?xml version="1.0" encoding="utf-8"?>
+<ds:datastoreItem xmlns:ds="http://schemas.openxmlformats.org/officeDocument/2006/customXml" ds:itemID="{0525DB26-18B2-4811-BBF6-3C9715F3F513}">
+  <ds:schemaRefs>
+    <ds:schemaRef ds:uri="http://schemas.openxmlformats.org/officeDocument/2006/bibliography"/>
+  </ds:schemaRefs>
+</ds:datastoreItem>
 </file>
</xml_diff>